<commit_message>
Documented Flink Watermark concept and logics to be implemeted in Flink
</commit_message>
<xml_diff>
--- a/docs/Project Information in detail.docx
+++ b/docs/Project Information in detail.docx
@@ -902,6 +902,9 @@
     <w:p/>
     <w:p>
       <w:r>
+        <w:rPr>
+          <w:noProof/>
+        </w:rPr>
         <w:drawing>
           <wp:inline distT="0" distB="0" distL="0" distR="0" wp14:anchorId="0CE00134" wp14:editId="089AD347">
             <wp:extent cx="3749365" cy="1828958"/>
@@ -947,6 +950,9 @@
     </w:p>
     <w:p>
       <w:r>
+        <w:rPr>
+          <w:noProof/>
+        </w:rPr>
         <w:drawing>
           <wp:inline distT="0" distB="0" distL="0" distR="0" wp14:anchorId="7451554F" wp14:editId="6F42A1F2">
             <wp:extent cx="1005927" cy="2057578"/>
@@ -1023,6 +1029,9 @@
         <w:br/>
       </w:r>
       <w:r>
+        <w:rPr>
+          <w:noProof/>
+        </w:rPr>
         <w:drawing>
           <wp:inline distT="0" distB="0" distL="0" distR="0" wp14:anchorId="129E2A53" wp14:editId="2AB446BA">
             <wp:extent cx="5943600" cy="2150110"/>
@@ -1317,10 +1326,7 @@
         <w:t xml:space="preserve"> partitions and </w:t>
       </w:r>
       <w:r>
-        <w:t>2</w:t>
-      </w:r>
-      <w:r>
-        <w:t xml:space="preserve"> </w:t>
+        <w:t xml:space="preserve">2 </w:t>
       </w:r>
       <w:proofErr w:type="gramStart"/>
       <w:r>
@@ -1411,8 +1417,6 @@
     <w:p>
       <w:r>
         <w:tab/>
-      </w:r>
-      <w:r>
         <w:t>environment:</w:t>
       </w:r>
     </w:p>
@@ -2497,8 +2501,6 @@
       </w:r>
       <w:r>
         <w:br/>
-      </w:r>
-      <w:r>
         <w:t>Spark Ordering and Latency Notes</w:t>
       </w:r>
     </w:p>
@@ -2613,7 +2615,788 @@
       </w:pPr>
     </w:p>
     <w:p/>
+    <w:p>
+      <w:pPr>
+        <w:rPr>
+          <w:sz w:val="32"/>
+          <w:szCs w:val="32"/>
+        </w:rPr>
+      </w:pPr>
+    </w:p>
+    <w:p>
+      <w:pPr>
+        <w:rPr>
+          <w:sz w:val="32"/>
+          <w:szCs w:val="32"/>
+        </w:rPr>
+      </w:pPr>
+    </w:p>
+    <w:p>
+      <w:pPr>
+        <w:rPr>
+          <w:sz w:val="32"/>
+          <w:szCs w:val="32"/>
+        </w:rPr>
+      </w:pPr>
+    </w:p>
+    <w:p>
+      <w:pPr>
+        <w:rPr>
+          <w:sz w:val="32"/>
+          <w:szCs w:val="32"/>
+        </w:rPr>
+      </w:pPr>
+    </w:p>
+    <w:p>
+      <w:pPr>
+        <w:rPr>
+          <w:sz w:val="32"/>
+          <w:szCs w:val="32"/>
+        </w:rPr>
+      </w:pPr>
+    </w:p>
+    <w:p>
+      <w:pPr>
+        <w:rPr>
+          <w:sz w:val="32"/>
+          <w:szCs w:val="32"/>
+        </w:rPr>
+      </w:pPr>
+    </w:p>
+    <w:p>
+      <w:pPr>
+        <w:rPr>
+          <w:sz w:val="32"/>
+          <w:szCs w:val="32"/>
+        </w:rPr>
+      </w:pPr>
+    </w:p>
+    <w:p>
+      <w:pPr>
+        <w:rPr>
+          <w:sz w:val="32"/>
+          <w:szCs w:val="32"/>
+        </w:rPr>
+      </w:pPr>
+    </w:p>
+    <w:p>
+      <w:pPr>
+        <w:rPr>
+          <w:sz w:val="32"/>
+          <w:szCs w:val="32"/>
+        </w:rPr>
+      </w:pPr>
+    </w:p>
+    <w:p>
+      <w:pPr>
+        <w:rPr>
+          <w:sz w:val="32"/>
+          <w:szCs w:val="32"/>
+        </w:rPr>
+      </w:pPr>
+    </w:p>
+    <w:p>
+      <w:pPr>
+        <w:jc w:val="center"/>
+        <w:rPr>
+          <w:sz w:val="36"/>
+          <w:szCs w:val="36"/>
+        </w:rPr>
+      </w:pPr>
+      <w:r>
+        <w:rPr>
+          <w:sz w:val="36"/>
+          <w:szCs w:val="36"/>
+        </w:rPr>
+        <w:lastRenderedPageBreak/>
+        <w:t>Flink Part</w:t>
+      </w:r>
+    </w:p>
+    <w:p>
+      <w:r>
+        <w:t>Supporting links:</w:t>
+      </w:r>
+      <w:r>
+        <w:br/>
+      </w:r>
+      <w:r>
+        <w:t xml:space="preserve">Example OHLC Candle Dashboard - </w:t>
+      </w:r>
+      <w:hyperlink r:id="rId10" w:history="1">
+        <w:r>
+          <w:rPr>
+            <w:rStyle w:val="Hyperlink"/>
+          </w:rPr>
+          <w:t>https://www.amcharts.com/demos/live-stock-data/</w:t>
+        </w:r>
+      </w:hyperlink>
+    </w:p>
+    <w:p>
+      <w:r>
+        <w:t xml:space="preserve">Pattern in OHLC Candles - </w:t>
+      </w:r>
+      <w:hyperlink r:id="rId11" w:history="1">
+        <w:r>
+          <w:rPr>
+            <w:rStyle w:val="Hyperlink"/>
+            <w:sz w:val="32"/>
+            <w:szCs w:val="32"/>
+          </w:rPr>
+          <w:t>https://questdb.com/glossary/ohlc-candlestick/</w:t>
+        </w:r>
+      </w:hyperlink>
+    </w:p>
+    <w:p>
+      <w:r>
+        <w:t>Which can be identified by AI.</w:t>
+      </w:r>
+    </w:p>
     <w:p/>
+    <w:p>
+      <w:pPr>
+        <w:rPr>
+          <w:b/>
+          <w:bCs/>
+        </w:rPr>
+      </w:pPr>
+      <w:r>
+        <w:rPr>
+          <w:b/>
+          <w:bCs/>
+        </w:rPr>
+        <w:t>Following is calculated by Flink for 1 min time window:</w:t>
+      </w:r>
+      <w:r>
+        <w:rPr>
+          <w:b/>
+          <w:bCs/>
+        </w:rPr>
+        <w:br/>
+      </w:r>
+    </w:p>
+    <w:p>
+      <w:r>
+        <w:t>OHLC prices</w:t>
+      </w:r>
+    </w:p>
+    <w:p>
+      <w:r>
+        <w:t xml:space="preserve"> VWAP</w:t>
+      </w:r>
+      <w:r>
+        <w:t xml:space="preserve"> </w:t>
+      </w:r>
+    </w:p>
+    <w:p>
+      <w:r>
+        <w:t>trade count</w:t>
+      </w:r>
+    </w:p>
+    <w:p>
+      <w:r>
+        <w:t>base volume</w:t>
+      </w:r>
+    </w:p>
+    <w:p>
+      <w:r>
+        <w:t>USD notional volume</w:t>
+      </w:r>
+    </w:p>
+    <w:p/>
+    <w:p>
+      <w:r>
+        <w:drawing>
+          <wp:inline distT="0" distB="0" distL="0" distR="0" wp14:anchorId="40FE5307" wp14:editId="01BD6332">
+            <wp:extent cx="5943600" cy="2226310"/>
+            <wp:effectExtent l="0" t="0" r="0" b="2540"/>
+            <wp:docPr id="240563185" name="Picture 1"/>
+            <wp:cNvGraphicFramePr>
+              <a:graphicFrameLocks xmlns:a="http://schemas.openxmlformats.org/drawingml/2006/main" noChangeAspect="1"/>
+            </wp:cNvGraphicFramePr>
+            <a:graphic xmlns:a="http://schemas.openxmlformats.org/drawingml/2006/main">
+              <a:graphicData uri="http://schemas.openxmlformats.org/drawingml/2006/picture">
+                <pic:pic xmlns:pic="http://schemas.openxmlformats.org/drawingml/2006/picture">
+                  <pic:nvPicPr>
+                    <pic:cNvPr id="240563185" name=""/>
+                    <pic:cNvPicPr/>
+                  </pic:nvPicPr>
+                  <pic:blipFill>
+                    <a:blip r:embed="rId12"/>
+                    <a:stretch>
+                      <a:fillRect/>
+                    </a:stretch>
+                  </pic:blipFill>
+                  <pic:spPr>
+                    <a:xfrm>
+                      <a:off x="0" y="0"/>
+                      <a:ext cx="5943600" cy="2226310"/>
+                    </a:xfrm>
+                    <a:prstGeom prst="rect">
+                      <a:avLst/>
+                    </a:prstGeom>
+                  </pic:spPr>
+                </pic:pic>
+              </a:graphicData>
+            </a:graphic>
+          </wp:inline>
+        </w:drawing>
+      </w:r>
+    </w:p>
+    <w:p>
+      <w:pPr>
+        <w:rPr>
+          <w:sz w:val="32"/>
+          <w:szCs w:val="32"/>
+        </w:rPr>
+      </w:pPr>
+    </w:p>
+    <w:p>
+      <w:r>
+        <w:t>Our Watermark – Allowing 30 seconds out-of-order arrival</w:t>
+      </w:r>
+    </w:p>
+    <w:p>
+      <w:proofErr w:type="spellStart"/>
+      <w:r>
+        <w:rPr>
+          <w:color w:val="EE0000"/>
+        </w:rPr>
+        <w:t>trade_time</w:t>
+      </w:r>
+      <w:proofErr w:type="spellEnd"/>
+      <w:r>
+        <w:rPr>
+          <w:color w:val="EE0000"/>
+        </w:rPr>
+        <w:t xml:space="preserve"> </w:t>
+      </w:r>
+      <w:r>
+        <w:t xml:space="preserve">will be used for 1 min window calculations – not </w:t>
+      </w:r>
+      <w:proofErr w:type="spellStart"/>
+      <w:r>
+        <w:t>kafka</w:t>
+      </w:r>
+      <w:proofErr w:type="spellEnd"/>
+      <w:r>
+        <w:t xml:space="preserve"> or system time</w:t>
+      </w:r>
+    </w:p>
+    <w:p/>
+    <w:p>
+      <w:r>
+        <w:lastRenderedPageBreak/>
+        <w:t>Use this Table to understand watermark concept and data arrival concept:</w:t>
+      </w:r>
+      <w:r>
+        <w:br/>
+      </w:r>
+      <w:r>
+        <w:br/>
+      </w:r>
+    </w:p>
+    <w:p>
+      <w:r>
+        <w:drawing>
+          <wp:inline distT="0" distB="0" distL="0" distR="0" wp14:anchorId="10B941E4" wp14:editId="13D89DAC">
+            <wp:extent cx="5943600" cy="3646170"/>
+            <wp:effectExtent l="0" t="0" r="0" b="0"/>
+            <wp:docPr id="787385386" name="Picture 1"/>
+            <wp:cNvGraphicFramePr>
+              <a:graphicFrameLocks xmlns:a="http://schemas.openxmlformats.org/drawingml/2006/main" noChangeAspect="1"/>
+            </wp:cNvGraphicFramePr>
+            <a:graphic xmlns:a="http://schemas.openxmlformats.org/drawingml/2006/main">
+              <a:graphicData uri="http://schemas.openxmlformats.org/drawingml/2006/picture">
+                <pic:pic xmlns:pic="http://schemas.openxmlformats.org/drawingml/2006/picture">
+                  <pic:nvPicPr>
+                    <pic:cNvPr id="787385386" name=""/>
+                    <pic:cNvPicPr/>
+                  </pic:nvPicPr>
+                  <pic:blipFill>
+                    <a:blip r:embed="rId13"/>
+                    <a:stretch>
+                      <a:fillRect/>
+                    </a:stretch>
+                  </pic:blipFill>
+                  <pic:spPr>
+                    <a:xfrm>
+                      <a:off x="0" y="0"/>
+                      <a:ext cx="5943600" cy="3646170"/>
+                    </a:xfrm>
+                    <a:prstGeom prst="rect">
+                      <a:avLst/>
+                    </a:prstGeom>
+                  </pic:spPr>
+                </pic:pic>
+              </a:graphicData>
+            </a:graphic>
+          </wp:inline>
+        </w:drawing>
+      </w:r>
+    </w:p>
+    <w:p/>
+    <w:p>
+      <w:r>
+        <w:t>My Understanding:</w:t>
+      </w:r>
+      <w:r>
+        <w:br/>
+      </w:r>
+      <w:r>
+        <w:t xml:space="preserve">Okay - I understood this from my </w:t>
+      </w:r>
+      <w:proofErr w:type="spellStart"/>
+      <w:r>
+        <w:t>intutuion</w:t>
+      </w:r>
+      <w:proofErr w:type="spellEnd"/>
+    </w:p>
+    <w:p>
+      <w:r>
+        <w:t xml:space="preserve">1 - It is possible that two windows </w:t>
+      </w:r>
+      <w:proofErr w:type="gramStart"/>
+      <w:r>
+        <w:t>remains</w:t>
+      </w:r>
+      <w:proofErr w:type="gramEnd"/>
+      <w:r>
+        <w:t xml:space="preserve"> open</w:t>
+      </w:r>
+      <w:r>
+        <w:br/>
+        <w:t>Because we are giving offset of 30 seconds to arrive the data which might belongs to the previous window.</w:t>
+      </w:r>
+    </w:p>
+    <w:p>
+      <w:r>
+        <w:t>2 - Window Already decided on the tread time, whatever the water mark is there</w:t>
+      </w:r>
+      <w:r>
+        <w:br/>
+        <w:t xml:space="preserve">e.g. Incoming trade: 12:00:02 </w:t>
+      </w:r>
+      <w:r>
+        <w:br/>
+        <w:t>Window: [12:00:00, 12:01:00) - will eventually lends here.</w:t>
+      </w:r>
+    </w:p>
+    <w:p>
+      <w:r>
+        <w:t xml:space="preserve">e.g. Incoming trade: 12:01:02 </w:t>
+      </w:r>
+      <w:r>
+        <w:br/>
+        <w:t xml:space="preserve">Window: [12:01:00, 12:02:00) - will eventually </w:t>
+      </w:r>
+      <w:proofErr w:type="gramStart"/>
+      <w:r>
+        <w:t>lends</w:t>
+      </w:r>
+      <w:proofErr w:type="gramEnd"/>
+      <w:r>
+        <w:t xml:space="preserve"> here.</w:t>
+      </w:r>
+    </w:p>
+    <w:p>
+      <w:r>
+        <w:t>3 - The watermark just decides when to close the window -</w:t>
+      </w:r>
+      <w:r>
+        <w:br/>
+        <w:t>Here when to from [12:00:00, 12:01:00) -&gt; [12:00:00, 12:01:00] &lt;- Close the window - when watermark becomes &gt;12:01:00 close the window.</w:t>
+      </w:r>
+    </w:p>
+    <w:p>
+      <w:proofErr w:type="gramStart"/>
+      <w:r>
+        <w:lastRenderedPageBreak/>
+        <w:t>so</w:t>
+      </w:r>
+      <w:proofErr w:type="gramEnd"/>
+      <w:r>
+        <w:t xml:space="preserve"> it only decides when to close the window and not which record will lend in which window or anything.</w:t>
+      </w:r>
+    </w:p>
+    <w:p>
+      <w:r>
+        <w:t xml:space="preserve">2 - If </w:t>
+      </w:r>
+      <w:proofErr w:type="spellStart"/>
+      <w:r>
+        <w:t>tread_time</w:t>
+      </w:r>
+      <w:proofErr w:type="spellEnd"/>
+      <w:r>
+        <w:t xml:space="preserve"> leap between 2 consecutive records </w:t>
+      </w:r>
+      <w:proofErr w:type="gramStart"/>
+      <w:r>
+        <w:t>are</w:t>
+      </w:r>
+      <w:proofErr w:type="gramEnd"/>
+      <w:r>
+        <w:t xml:space="preserve"> large then the previous window will shut early - because that watermark after </w:t>
+      </w:r>
+      <w:proofErr w:type="spellStart"/>
+      <w:proofErr w:type="gramStart"/>
+      <w:r>
+        <w:t>substracting</w:t>
+      </w:r>
+      <w:proofErr w:type="spellEnd"/>
+      <w:proofErr w:type="gramEnd"/>
+      <w:r>
+        <w:t xml:space="preserve"> 30 from the trade time also comes closer to 12:00:59.99 very fast.</w:t>
+      </w:r>
+    </w:p>
+    <w:p>
+      <w:r>
+        <w:t xml:space="preserve">3 - if </w:t>
+      </w:r>
+      <w:proofErr w:type="spellStart"/>
+      <w:r>
+        <w:t>trade_time</w:t>
+      </w:r>
+      <w:proofErr w:type="spellEnd"/>
+      <w:r>
+        <w:t xml:space="preserve"> leap between 2 consecutive records </w:t>
+      </w:r>
+      <w:proofErr w:type="gramStart"/>
+      <w:r>
+        <w:t>are</w:t>
+      </w:r>
+      <w:proofErr w:type="gramEnd"/>
+      <w:r>
+        <w:t xml:space="preserve"> small (for e.g. 1-1 second) then the previous window stays open for longer </w:t>
+      </w:r>
+      <w:proofErr w:type="gramStart"/>
+      <w:r>
+        <w:t>period of time</w:t>
+      </w:r>
+      <w:proofErr w:type="gramEnd"/>
+      <w:r>
+        <w:t xml:space="preserve"> - because watermark comes closer to 12:00:59.99 very slow (after roughly 1 -1 second). Allows more time to the older records which belongs might </w:t>
+      </w:r>
+      <w:proofErr w:type="gramStart"/>
+      <w:r>
+        <w:t>belongs</w:t>
+      </w:r>
+      <w:proofErr w:type="gramEnd"/>
+      <w:r>
+        <w:t xml:space="preserve"> to the previous window.</w:t>
+      </w:r>
+    </w:p>
+    <w:p/>
+    <w:p/>
+    <w:p>
+      <w:r>
+        <w:t>Curated that perfect understanding with AI:</w:t>
+      </w:r>
+      <w:r>
+        <w:br/>
+      </w:r>
+      <w:r>
+        <w:br/>
+      </w:r>
+      <w:r>
+        <w:t>Your intuition is right. A few precise refinements:</w:t>
+      </w:r>
+    </w:p>
+    <w:p>
+      <w:pPr>
+        <w:numPr>
+          <w:ilvl w:val="0"/>
+          <w:numId w:val="5"/>
+        </w:numPr>
+      </w:pPr>
+      <w:r>
+        <w:t>Yes—multiple windows can be open at the same time.</w:t>
+      </w:r>
+    </w:p>
+    <w:p>
+      <w:r>
+        <w:t xml:space="preserve">With one-minute windows and a 30-second watermark delay, it is common for the </w:t>
+      </w:r>
+      <w:proofErr w:type="gramStart"/>
+      <w:r>
+        <w:t>current minute</w:t>
+      </w:r>
+      <w:proofErr w:type="gramEnd"/>
+      <w:r>
+        <w:t xml:space="preserve"> and previous minute </w:t>
+      </w:r>
+      <w:proofErr w:type="gramStart"/>
+      <w:r>
+        <w:t>to both</w:t>
+      </w:r>
+      <w:proofErr w:type="gramEnd"/>
+      <w:r>
+        <w:t xml:space="preserve"> remain open.</w:t>
+      </w:r>
+    </w:p>
+    <w:p>
+      <w:r>
+        <w:t>Current event time around 12:01:20</w:t>
+      </w:r>
+    </w:p>
+    <w:p>
+      <w:r>
+        <w:t>Watermark around 12:00:50</w:t>
+      </w:r>
+    </w:p>
+    <w:p/>
+    <w:p>
+      <w:r>
+        <w:t>Open windows:</w:t>
+      </w:r>
+    </w:p>
+    <w:p>
+      <w:r>
+        <w:t>[12:00:00, 12:01:00)</w:t>
+      </w:r>
+    </w:p>
+    <w:p>
+      <w:r>
+        <w:t>[12:01:00, 12:02:00)</w:t>
+      </w:r>
+    </w:p>
+    <w:p>
+      <w:r>
+        <w:t xml:space="preserve">In unusual </w:t>
+      </w:r>
+      <w:proofErr w:type="gramStart"/>
+      <w:r>
+        <w:t>cases—slow partitions</w:t>
+      </w:r>
+      <w:proofErr w:type="gramEnd"/>
+      <w:r>
+        <w:t>, idle-input handling, or a larger watermark delay—more than two windows may remain open.</w:t>
+      </w:r>
+    </w:p>
+    <w:p>
+      <w:pPr>
+        <w:numPr>
+          <w:ilvl w:val="0"/>
+          <w:numId w:val="6"/>
+        </w:numPr>
+      </w:pPr>
+      <w:r>
+        <w:t xml:space="preserve">Correct: </w:t>
+      </w:r>
+      <w:proofErr w:type="spellStart"/>
+      <w:r>
+        <w:t>trade_time</w:t>
+      </w:r>
+      <w:proofErr w:type="spellEnd"/>
+      <w:r>
+        <w:t xml:space="preserve"> selects the window.</w:t>
+      </w:r>
+    </w:p>
+    <w:p>
+      <w:r>
+        <w:t>12:00:02 → [12:00:00, 12:01:00)</w:t>
+      </w:r>
+    </w:p>
+    <w:p>
+      <w:r>
+        <w:t>12:01:02 → [12:01:00, 12:02:00)</w:t>
+      </w:r>
+    </w:p>
+    <w:p>
+      <w:r>
+        <w:lastRenderedPageBreak/>
+        <w:t>Watermark never moves a trade into another minute. The only exception is a trade that arrives after its original window has been cleaned up; then Flink sends it to the late-events path rather than changing its bucket.</w:t>
+      </w:r>
+    </w:p>
+    <w:p>
+      <w:pPr>
+        <w:numPr>
+          <w:ilvl w:val="0"/>
+          <w:numId w:val="7"/>
+        </w:numPr>
+      </w:pPr>
+      <w:r>
+        <w:t>Correct: watermark controls finalization.</w:t>
+      </w:r>
+    </w:p>
+    <w:p>
+      <w:r>
+        <w:t>Use an end-exclusive window notation:</w:t>
+      </w:r>
+    </w:p>
+    <w:p>
+      <w:r>
+        <w:t>[12:00:00, 12:01:00)</w:t>
+      </w:r>
+    </w:p>
+    <w:p>
+      <w:r>
+        <w:t>The 12:00 window closes when:</w:t>
+      </w:r>
+    </w:p>
+    <w:p>
+      <w:r>
+        <w:t>watermark &gt;= 12:01:00</w:t>
+      </w:r>
+    </w:p>
+    <w:p>
+      <w:r>
+        <w:t>It then has its final normal result emitted and its state can later be removed.</w:t>
+      </w:r>
+    </w:p>
+    <w:p>
+      <w:pPr>
+        <w:numPr>
+          <w:ilvl w:val="0"/>
+          <w:numId w:val="8"/>
+        </w:numPr>
+      </w:pPr>
+      <w:r>
+        <w:t>Correct: a large event-time jump advances the watermark quickly.</w:t>
+      </w:r>
+    </w:p>
+    <w:p>
+      <w:r>
+        <w:t>Example:</w:t>
+      </w:r>
+    </w:p>
+    <w:p>
+      <w:r>
+        <w:t xml:space="preserve">Previous maximum </w:t>
+      </w:r>
+      <w:proofErr w:type="spellStart"/>
+      <w:r>
+        <w:t>trade_time</w:t>
+      </w:r>
+      <w:proofErr w:type="spellEnd"/>
+      <w:r>
+        <w:t>: 12:00:20</w:t>
+      </w:r>
+    </w:p>
+    <w:p>
+      <w:r>
+        <w:t xml:space="preserve">New incoming </w:t>
+      </w:r>
+      <w:proofErr w:type="spellStart"/>
+      <w:r>
+        <w:t>trade_time</w:t>
+      </w:r>
+      <w:proofErr w:type="spellEnd"/>
+      <w:r>
+        <w:t>:     12:05:00</w:t>
+      </w:r>
+    </w:p>
+    <w:p>
+      <w:r>
+        <w:t>New watermark:               12:04:30</w:t>
+      </w:r>
+    </w:p>
+    <w:p>
+      <w:r>
+        <w:t>That closes the 12:00, 12:01, 12:02, and 12:03 windows quickly.</w:t>
+      </w:r>
+    </w:p>
+    <w:p>
+      <w:r>
+        <w:t xml:space="preserve">It is not “early” in event-time terms—the watermark says the source has progressed far beyond them. But it can be early in wall-clock terms if old data arrives unusually late afterward. That is why we retain a late-events path and may configure </w:t>
+      </w:r>
+      <w:proofErr w:type="spellStart"/>
+      <w:r>
+        <w:t>allowedLateness</w:t>
+      </w:r>
+      <w:proofErr w:type="spellEnd"/>
+      <w:r>
+        <w:t>.</w:t>
+      </w:r>
+    </w:p>
+    <w:p>
+      <w:pPr>
+        <w:numPr>
+          <w:ilvl w:val="0"/>
+          <w:numId w:val="9"/>
+        </w:numPr>
+      </w:pPr>
+      <w:r>
+        <w:t>Correct: small event-time increments make watermark progress slowly.</w:t>
+      </w:r>
+    </w:p>
+    <w:p>
+      <w:r>
+        <w:t>If trade times progress second by second, the watermark also progresses second by second. The prior window stays open until the watermark reaches its end.</w:t>
+      </w:r>
+    </w:p>
+    <w:p>
+      <w:proofErr w:type="spellStart"/>
+      <w:r>
+        <w:t>trade_time</w:t>
+      </w:r>
+      <w:proofErr w:type="spellEnd"/>
+      <w:r>
+        <w:t>: 12:01:20</w:t>
+      </w:r>
+    </w:p>
+    <w:p>
+      <w:r>
+        <w:t>watermark: 12:00:50</w:t>
+      </w:r>
+    </w:p>
+    <w:p>
+      <w:r>
+        <w:t>→ 12:00 window remains open</w:t>
+      </w:r>
+    </w:p>
+    <w:p/>
+    <w:p>
+      <w:proofErr w:type="spellStart"/>
+      <w:r>
+        <w:t>trade_time</w:t>
+      </w:r>
+      <w:proofErr w:type="spellEnd"/>
+      <w:r>
+        <w:t>: 12:01:30</w:t>
+      </w:r>
+    </w:p>
+    <w:p>
+      <w:r>
+        <w:t>watermark: 12:01:00</w:t>
+      </w:r>
+    </w:p>
+    <w:p>
+      <w:r>
+        <w:lastRenderedPageBreak/>
+        <w:t>→ 12:00 window can close</w:t>
+      </w:r>
+    </w:p>
+    <w:p>
+      <w:r>
+        <w:t>So yes: slower watermark progress gives delayed older records more real arrival-time opportunity to reach their correct previous window.</w:t>
+      </w:r>
+    </w:p>
+    <w:p/>
+    <w:p>
+      <w:pPr>
+        <w:rPr>
+          <w:sz w:val="32"/>
+          <w:szCs w:val="32"/>
+        </w:rPr>
+      </w:pPr>
+    </w:p>
+    <w:p>
+      <w:pPr>
+        <w:rPr>
+          <w:sz w:val="32"/>
+          <w:szCs w:val="32"/>
+        </w:rPr>
+      </w:pPr>
+    </w:p>
+    <w:p>
+      <w:pPr>
+        <w:rPr>
+          <w:sz w:val="32"/>
+          <w:szCs w:val="32"/>
+        </w:rPr>
+      </w:pPr>
+    </w:p>
     <w:sectPr>
       <w:pgSz w:w="12240" w:h="15840"/>
       <w:pgMar w:top="1440" w:right="1440" w:bottom="1440" w:left="1440" w:header="720" w:footer="720" w:gutter="0"/>
@@ -2627,6 +3410,119 @@
 <file path=word/numbering.xml><?xml version="1.0" encoding="utf-8"?>
 <w:numbering xmlns:wpc="http://schemas.microsoft.com/office/word/2010/wordprocessingCanvas" xmlns:cx="http://schemas.microsoft.com/office/drawing/2014/chartex" xmlns:cx1="http://schemas.microsoft.com/office/drawing/2015/9/8/chartex" xmlns:cx2="http://schemas.microsoft.com/office/drawing/2015/10/21/chartex" xmlns:cx3="http://schemas.microsoft.com/office/drawing/2016/5/9/chartex" xmlns:cx4="http://schemas.microsoft.com/office/drawing/2016/5/10/chartex" xmlns:cx5="http://schemas.microsoft.com/office/drawing/2016/5/11/chartex" xmlns:cx6="http://schemas.microsoft.com/office/drawing/2016/5/12/chartex" xmlns:cx7="http://schemas.microsoft.com/office/drawing/2016/5/13/chartex" xmlns:cx8="http://schemas.microsoft.com/office/drawing/2016/5/14/chartex" xmlns:mc="http://schemas.openxmlformats.org/markup-compatibility/2006" xmlns:aink="http://schemas.microsoft.com/office/drawing/2016/ink" xmlns:am3d="http://schemas.microsoft.com/office/drawing/2017/model3d" xmlns:o="urn:schemas-microsoft-com:office:office" xmlns:oel="http://schemas.microsoft.com/office/2019/extlst" xmlns:r="http://schemas.openxmlformats.org/officeDocument/2006/relationships" xmlns:m="http://schemas.openxmlformats.org/officeDocument/2006/math" xmlns:v="urn:schemas-microsoft-com:vml" xmlns:wp14="http://schemas.microsoft.com/office/word/2010/wordprocessingDrawing" xmlns:wp="http://schemas.openxmlformats.org/drawingml/2006/wordprocessingDrawing" xmlns:w10="urn:schemas-microsoft-com:office:word" xmlns:w="http://schemas.openxmlformats.org/wordprocessingml/2006/main" xmlns:w14="http://schemas.microsoft.com/office/word/2010/wordml" xmlns:w15="http://schemas.microsoft.com/office/word/2012/wordml" xmlns:w16cex="http://schemas.microsoft.com/office/word/2018/wordml/cex" xmlns:w16cid="http://schemas.microsoft.com/office/word/2016/wordml/cid" xmlns:w16="http://schemas.microsoft.com/office/word/2018/wordml" xmlns:w16du="http://schemas.microsoft.com/office/word/2023/wordml/word16du" xmlns:w16sdtdh="http://schemas.microsoft.com/office/word/2020/wordml/sdtdatahash" xmlns:w16sdtfl="http://schemas.microsoft.com/office/word/2024/wordml/sdtformatlock" xmlns:w16se="http://schemas.microsoft.com/office/word/2015/wordml/symex" xmlns:wpg="http://schemas.microsoft.com/office/word/2010/wordprocessingGroup" xmlns:wpi="http://schemas.microsoft.com/office/word/2010/wordprocessingInk" xmlns:wne="http://schemas.microsoft.com/office/word/2006/wordml" xmlns:wps="http://schemas.microsoft.com/office/word/2010/wordprocessingShape" mc:Ignorable="w14 w15 w16se w16cid w16 w16cex w16sdtdh w16sdtfl w16du wp14">
   <w:abstractNum w:abstractNumId="0" w15:restartNumberingAfterBreak="0">
+    <w:nsid w:val="0B491BDA"/>
+    <w:multiLevelType w:val="multilevel"/>
+    <w:tmpl w:val="72DCCC4E"/>
+    <w:lvl w:ilvl="0">
+      <w:start w:val="1"/>
+      <w:numFmt w:val="decimal"/>
+      <w:lvlText w:val="%1."/>
+      <w:lvlJc w:val="left"/>
+      <w:pPr>
+        <w:tabs>
+          <w:tab w:val="num" w:pos="720"/>
+        </w:tabs>
+        <w:ind w:left="720" w:hanging="360"/>
+      </w:pPr>
+    </w:lvl>
+    <w:lvl w:ilvl="1" w:tentative="1">
+      <w:start w:val="1"/>
+      <w:numFmt w:val="decimal"/>
+      <w:lvlText w:val="%2."/>
+      <w:lvlJc w:val="left"/>
+      <w:pPr>
+        <w:tabs>
+          <w:tab w:val="num" w:pos="1440"/>
+        </w:tabs>
+        <w:ind w:left="1440" w:hanging="360"/>
+      </w:pPr>
+    </w:lvl>
+    <w:lvl w:ilvl="2" w:tentative="1">
+      <w:start w:val="1"/>
+      <w:numFmt w:val="decimal"/>
+      <w:lvlText w:val="%3."/>
+      <w:lvlJc w:val="left"/>
+      <w:pPr>
+        <w:tabs>
+          <w:tab w:val="num" w:pos="2160"/>
+        </w:tabs>
+        <w:ind w:left="2160" w:hanging="360"/>
+      </w:pPr>
+    </w:lvl>
+    <w:lvl w:ilvl="3" w:tentative="1">
+      <w:start w:val="1"/>
+      <w:numFmt w:val="decimal"/>
+      <w:lvlText w:val="%4."/>
+      <w:lvlJc w:val="left"/>
+      <w:pPr>
+        <w:tabs>
+          <w:tab w:val="num" w:pos="2880"/>
+        </w:tabs>
+        <w:ind w:left="2880" w:hanging="360"/>
+      </w:pPr>
+    </w:lvl>
+    <w:lvl w:ilvl="4" w:tentative="1">
+      <w:start w:val="1"/>
+      <w:numFmt w:val="decimal"/>
+      <w:lvlText w:val="%5."/>
+      <w:lvlJc w:val="left"/>
+      <w:pPr>
+        <w:tabs>
+          <w:tab w:val="num" w:pos="3600"/>
+        </w:tabs>
+        <w:ind w:left="3600" w:hanging="360"/>
+      </w:pPr>
+    </w:lvl>
+    <w:lvl w:ilvl="5" w:tentative="1">
+      <w:start w:val="1"/>
+      <w:numFmt w:val="decimal"/>
+      <w:lvlText w:val="%6."/>
+      <w:lvlJc w:val="left"/>
+      <w:pPr>
+        <w:tabs>
+          <w:tab w:val="num" w:pos="4320"/>
+        </w:tabs>
+        <w:ind w:left="4320" w:hanging="360"/>
+      </w:pPr>
+    </w:lvl>
+    <w:lvl w:ilvl="6" w:tentative="1">
+      <w:start w:val="1"/>
+      <w:numFmt w:val="decimal"/>
+      <w:lvlText w:val="%7."/>
+      <w:lvlJc w:val="left"/>
+      <w:pPr>
+        <w:tabs>
+          <w:tab w:val="num" w:pos="5040"/>
+        </w:tabs>
+        <w:ind w:left="5040" w:hanging="360"/>
+      </w:pPr>
+    </w:lvl>
+    <w:lvl w:ilvl="7" w:tentative="1">
+      <w:start w:val="1"/>
+      <w:numFmt w:val="decimal"/>
+      <w:lvlText w:val="%8."/>
+      <w:lvlJc w:val="left"/>
+      <w:pPr>
+        <w:tabs>
+          <w:tab w:val="num" w:pos="5760"/>
+        </w:tabs>
+        <w:ind w:left="5760" w:hanging="360"/>
+      </w:pPr>
+    </w:lvl>
+    <w:lvl w:ilvl="8" w:tentative="1">
+      <w:start w:val="1"/>
+      <w:numFmt w:val="decimal"/>
+      <w:lvlText w:val="%9."/>
+      <w:lvlJc w:val="left"/>
+      <w:pPr>
+        <w:tabs>
+          <w:tab w:val="num" w:pos="6480"/>
+        </w:tabs>
+        <w:ind w:left="6480" w:hanging="360"/>
+      </w:pPr>
+    </w:lvl>
+  </w:abstractNum>
+  <w:abstractNum w:abstractNumId="1" w15:restartNumberingAfterBreak="0">
     <w:nsid w:val="1BE42A84"/>
     <w:multiLevelType w:val="hybridMultilevel"/>
     <w:tmpl w:val="72B4C27A"/>
@@ -2739,7 +3635,120 @@
       </w:rPr>
     </w:lvl>
   </w:abstractNum>
-  <w:abstractNum w:abstractNumId="1" w15:restartNumberingAfterBreak="0">
+  <w:abstractNum w:abstractNumId="2" w15:restartNumberingAfterBreak="0">
+    <w:nsid w:val="22223CBB"/>
+    <w:multiLevelType w:val="multilevel"/>
+    <w:tmpl w:val="1D0A7408"/>
+    <w:lvl w:ilvl="0">
+      <w:start w:val="2"/>
+      <w:numFmt w:val="decimal"/>
+      <w:lvlText w:val="%1."/>
+      <w:lvlJc w:val="left"/>
+      <w:pPr>
+        <w:tabs>
+          <w:tab w:val="num" w:pos="720"/>
+        </w:tabs>
+        <w:ind w:left="720" w:hanging="360"/>
+      </w:pPr>
+    </w:lvl>
+    <w:lvl w:ilvl="1" w:tentative="1">
+      <w:start w:val="1"/>
+      <w:numFmt w:val="decimal"/>
+      <w:lvlText w:val="%2."/>
+      <w:lvlJc w:val="left"/>
+      <w:pPr>
+        <w:tabs>
+          <w:tab w:val="num" w:pos="1440"/>
+        </w:tabs>
+        <w:ind w:left="1440" w:hanging="360"/>
+      </w:pPr>
+    </w:lvl>
+    <w:lvl w:ilvl="2" w:tentative="1">
+      <w:start w:val="1"/>
+      <w:numFmt w:val="decimal"/>
+      <w:lvlText w:val="%3."/>
+      <w:lvlJc w:val="left"/>
+      <w:pPr>
+        <w:tabs>
+          <w:tab w:val="num" w:pos="2160"/>
+        </w:tabs>
+        <w:ind w:left="2160" w:hanging="360"/>
+      </w:pPr>
+    </w:lvl>
+    <w:lvl w:ilvl="3" w:tentative="1">
+      <w:start w:val="1"/>
+      <w:numFmt w:val="decimal"/>
+      <w:lvlText w:val="%4."/>
+      <w:lvlJc w:val="left"/>
+      <w:pPr>
+        <w:tabs>
+          <w:tab w:val="num" w:pos="2880"/>
+        </w:tabs>
+        <w:ind w:left="2880" w:hanging="360"/>
+      </w:pPr>
+    </w:lvl>
+    <w:lvl w:ilvl="4" w:tentative="1">
+      <w:start w:val="1"/>
+      <w:numFmt w:val="decimal"/>
+      <w:lvlText w:val="%5."/>
+      <w:lvlJc w:val="left"/>
+      <w:pPr>
+        <w:tabs>
+          <w:tab w:val="num" w:pos="3600"/>
+        </w:tabs>
+        <w:ind w:left="3600" w:hanging="360"/>
+      </w:pPr>
+    </w:lvl>
+    <w:lvl w:ilvl="5" w:tentative="1">
+      <w:start w:val="1"/>
+      <w:numFmt w:val="decimal"/>
+      <w:lvlText w:val="%6."/>
+      <w:lvlJc w:val="left"/>
+      <w:pPr>
+        <w:tabs>
+          <w:tab w:val="num" w:pos="4320"/>
+        </w:tabs>
+        <w:ind w:left="4320" w:hanging="360"/>
+      </w:pPr>
+    </w:lvl>
+    <w:lvl w:ilvl="6" w:tentative="1">
+      <w:start w:val="1"/>
+      <w:numFmt w:val="decimal"/>
+      <w:lvlText w:val="%7."/>
+      <w:lvlJc w:val="left"/>
+      <w:pPr>
+        <w:tabs>
+          <w:tab w:val="num" w:pos="5040"/>
+        </w:tabs>
+        <w:ind w:left="5040" w:hanging="360"/>
+      </w:pPr>
+    </w:lvl>
+    <w:lvl w:ilvl="7" w:tentative="1">
+      <w:start w:val="1"/>
+      <w:numFmt w:val="decimal"/>
+      <w:lvlText w:val="%8."/>
+      <w:lvlJc w:val="left"/>
+      <w:pPr>
+        <w:tabs>
+          <w:tab w:val="num" w:pos="5760"/>
+        </w:tabs>
+        <w:ind w:left="5760" w:hanging="360"/>
+      </w:pPr>
+    </w:lvl>
+    <w:lvl w:ilvl="8" w:tentative="1">
+      <w:start w:val="1"/>
+      <w:numFmt w:val="decimal"/>
+      <w:lvlText w:val="%9."/>
+      <w:lvlJc w:val="left"/>
+      <w:pPr>
+        <w:tabs>
+          <w:tab w:val="num" w:pos="6480"/>
+        </w:tabs>
+        <w:ind w:left="6480" w:hanging="360"/>
+      </w:pPr>
+    </w:lvl>
+  </w:abstractNum>
+  <w:abstractNum w:abstractNumId="3" w15:restartNumberingAfterBreak="0">
     <w:nsid w:val="254C7F94"/>
     <w:multiLevelType w:val="multilevel"/>
     <w:tmpl w:val="537C1A1A"/>
@@ -2888,7 +3897,7 @@
       </w:rPr>
     </w:lvl>
   </w:abstractNum>
-  <w:abstractNum w:abstractNumId="2" w15:restartNumberingAfterBreak="0">
+  <w:abstractNum w:abstractNumId="4" w15:restartNumberingAfterBreak="0">
     <w:nsid w:val="2D9E4CB0"/>
     <w:multiLevelType w:val="multilevel"/>
     <w:tmpl w:val="FFFFFFFF"/>
@@ -3037,7 +4046,120 @@
       </w:rPr>
     </w:lvl>
   </w:abstractNum>
-  <w:abstractNum w:abstractNumId="3" w15:restartNumberingAfterBreak="0">
+  <w:abstractNum w:abstractNumId="5" w15:restartNumberingAfterBreak="0">
+    <w:nsid w:val="4B7A3F27"/>
+    <w:multiLevelType w:val="multilevel"/>
+    <w:tmpl w:val="F61E653A"/>
+    <w:lvl w:ilvl="0">
+      <w:start w:val="4"/>
+      <w:numFmt w:val="decimal"/>
+      <w:lvlText w:val="%1."/>
+      <w:lvlJc w:val="left"/>
+      <w:pPr>
+        <w:tabs>
+          <w:tab w:val="num" w:pos="720"/>
+        </w:tabs>
+        <w:ind w:left="720" w:hanging="360"/>
+      </w:pPr>
+    </w:lvl>
+    <w:lvl w:ilvl="1" w:tentative="1">
+      <w:start w:val="1"/>
+      <w:numFmt w:val="decimal"/>
+      <w:lvlText w:val="%2."/>
+      <w:lvlJc w:val="left"/>
+      <w:pPr>
+        <w:tabs>
+          <w:tab w:val="num" w:pos="1440"/>
+        </w:tabs>
+        <w:ind w:left="1440" w:hanging="360"/>
+      </w:pPr>
+    </w:lvl>
+    <w:lvl w:ilvl="2" w:tentative="1">
+      <w:start w:val="1"/>
+      <w:numFmt w:val="decimal"/>
+      <w:lvlText w:val="%3."/>
+      <w:lvlJc w:val="left"/>
+      <w:pPr>
+        <w:tabs>
+          <w:tab w:val="num" w:pos="2160"/>
+        </w:tabs>
+        <w:ind w:left="2160" w:hanging="360"/>
+      </w:pPr>
+    </w:lvl>
+    <w:lvl w:ilvl="3" w:tentative="1">
+      <w:start w:val="1"/>
+      <w:numFmt w:val="decimal"/>
+      <w:lvlText w:val="%4."/>
+      <w:lvlJc w:val="left"/>
+      <w:pPr>
+        <w:tabs>
+          <w:tab w:val="num" w:pos="2880"/>
+        </w:tabs>
+        <w:ind w:left="2880" w:hanging="360"/>
+      </w:pPr>
+    </w:lvl>
+    <w:lvl w:ilvl="4" w:tentative="1">
+      <w:start w:val="1"/>
+      <w:numFmt w:val="decimal"/>
+      <w:lvlText w:val="%5."/>
+      <w:lvlJc w:val="left"/>
+      <w:pPr>
+        <w:tabs>
+          <w:tab w:val="num" w:pos="3600"/>
+        </w:tabs>
+        <w:ind w:left="3600" w:hanging="360"/>
+      </w:pPr>
+    </w:lvl>
+    <w:lvl w:ilvl="5" w:tentative="1">
+      <w:start w:val="1"/>
+      <w:numFmt w:val="decimal"/>
+      <w:lvlText w:val="%6."/>
+      <w:lvlJc w:val="left"/>
+      <w:pPr>
+        <w:tabs>
+          <w:tab w:val="num" w:pos="4320"/>
+        </w:tabs>
+        <w:ind w:left="4320" w:hanging="360"/>
+      </w:pPr>
+    </w:lvl>
+    <w:lvl w:ilvl="6" w:tentative="1">
+      <w:start w:val="1"/>
+      <w:numFmt w:val="decimal"/>
+      <w:lvlText w:val="%7."/>
+      <w:lvlJc w:val="left"/>
+      <w:pPr>
+        <w:tabs>
+          <w:tab w:val="num" w:pos="5040"/>
+        </w:tabs>
+        <w:ind w:left="5040" w:hanging="360"/>
+      </w:pPr>
+    </w:lvl>
+    <w:lvl w:ilvl="7" w:tentative="1">
+      <w:start w:val="1"/>
+      <w:numFmt w:val="decimal"/>
+      <w:lvlText w:val="%8."/>
+      <w:lvlJc w:val="left"/>
+      <w:pPr>
+        <w:tabs>
+          <w:tab w:val="num" w:pos="5760"/>
+        </w:tabs>
+        <w:ind w:left="5760" w:hanging="360"/>
+      </w:pPr>
+    </w:lvl>
+    <w:lvl w:ilvl="8" w:tentative="1">
+      <w:start w:val="1"/>
+      <w:numFmt w:val="decimal"/>
+      <w:lvlText w:val="%9."/>
+      <w:lvlJc w:val="left"/>
+      <w:pPr>
+        <w:tabs>
+          <w:tab w:val="num" w:pos="6480"/>
+        </w:tabs>
+        <w:ind w:left="6480" w:hanging="360"/>
+      </w:pPr>
+    </w:lvl>
+  </w:abstractNum>
+  <w:abstractNum w:abstractNumId="6" w15:restartNumberingAfterBreak="0">
     <w:nsid w:val="4E5133F4"/>
     <w:multiLevelType w:val="multilevel"/>
     <w:tmpl w:val="A34ADC32"/>
@@ -3186,17 +4308,258 @@
       </w:rPr>
     </w:lvl>
   </w:abstractNum>
+  <w:abstractNum w:abstractNumId="7" w15:restartNumberingAfterBreak="0">
+    <w:nsid w:val="619B4BC2"/>
+    <w:multiLevelType w:val="multilevel"/>
+    <w:tmpl w:val="4ABA5052"/>
+    <w:lvl w:ilvl="0">
+      <w:start w:val="5"/>
+      <w:numFmt w:val="decimal"/>
+      <w:lvlText w:val="%1."/>
+      <w:lvlJc w:val="left"/>
+      <w:pPr>
+        <w:tabs>
+          <w:tab w:val="num" w:pos="720"/>
+        </w:tabs>
+        <w:ind w:left="720" w:hanging="360"/>
+      </w:pPr>
+    </w:lvl>
+    <w:lvl w:ilvl="1" w:tentative="1">
+      <w:start w:val="1"/>
+      <w:numFmt w:val="decimal"/>
+      <w:lvlText w:val="%2."/>
+      <w:lvlJc w:val="left"/>
+      <w:pPr>
+        <w:tabs>
+          <w:tab w:val="num" w:pos="1440"/>
+        </w:tabs>
+        <w:ind w:left="1440" w:hanging="360"/>
+      </w:pPr>
+    </w:lvl>
+    <w:lvl w:ilvl="2" w:tentative="1">
+      <w:start w:val="1"/>
+      <w:numFmt w:val="decimal"/>
+      <w:lvlText w:val="%3."/>
+      <w:lvlJc w:val="left"/>
+      <w:pPr>
+        <w:tabs>
+          <w:tab w:val="num" w:pos="2160"/>
+        </w:tabs>
+        <w:ind w:left="2160" w:hanging="360"/>
+      </w:pPr>
+    </w:lvl>
+    <w:lvl w:ilvl="3" w:tentative="1">
+      <w:start w:val="1"/>
+      <w:numFmt w:val="decimal"/>
+      <w:lvlText w:val="%4."/>
+      <w:lvlJc w:val="left"/>
+      <w:pPr>
+        <w:tabs>
+          <w:tab w:val="num" w:pos="2880"/>
+        </w:tabs>
+        <w:ind w:left="2880" w:hanging="360"/>
+      </w:pPr>
+    </w:lvl>
+    <w:lvl w:ilvl="4" w:tentative="1">
+      <w:start w:val="1"/>
+      <w:numFmt w:val="decimal"/>
+      <w:lvlText w:val="%5."/>
+      <w:lvlJc w:val="left"/>
+      <w:pPr>
+        <w:tabs>
+          <w:tab w:val="num" w:pos="3600"/>
+        </w:tabs>
+        <w:ind w:left="3600" w:hanging="360"/>
+      </w:pPr>
+    </w:lvl>
+    <w:lvl w:ilvl="5" w:tentative="1">
+      <w:start w:val="1"/>
+      <w:numFmt w:val="decimal"/>
+      <w:lvlText w:val="%6."/>
+      <w:lvlJc w:val="left"/>
+      <w:pPr>
+        <w:tabs>
+          <w:tab w:val="num" w:pos="4320"/>
+        </w:tabs>
+        <w:ind w:left="4320" w:hanging="360"/>
+      </w:pPr>
+    </w:lvl>
+    <w:lvl w:ilvl="6" w:tentative="1">
+      <w:start w:val="1"/>
+      <w:numFmt w:val="decimal"/>
+      <w:lvlText w:val="%7."/>
+      <w:lvlJc w:val="left"/>
+      <w:pPr>
+        <w:tabs>
+          <w:tab w:val="num" w:pos="5040"/>
+        </w:tabs>
+        <w:ind w:left="5040" w:hanging="360"/>
+      </w:pPr>
+    </w:lvl>
+    <w:lvl w:ilvl="7" w:tentative="1">
+      <w:start w:val="1"/>
+      <w:numFmt w:val="decimal"/>
+      <w:lvlText w:val="%8."/>
+      <w:lvlJc w:val="left"/>
+      <w:pPr>
+        <w:tabs>
+          <w:tab w:val="num" w:pos="5760"/>
+        </w:tabs>
+        <w:ind w:left="5760" w:hanging="360"/>
+      </w:pPr>
+    </w:lvl>
+    <w:lvl w:ilvl="8" w:tentative="1">
+      <w:start w:val="1"/>
+      <w:numFmt w:val="decimal"/>
+      <w:lvlText w:val="%9."/>
+      <w:lvlJc w:val="left"/>
+      <w:pPr>
+        <w:tabs>
+          <w:tab w:val="num" w:pos="6480"/>
+        </w:tabs>
+        <w:ind w:left="6480" w:hanging="360"/>
+      </w:pPr>
+    </w:lvl>
+  </w:abstractNum>
+  <w:abstractNum w:abstractNumId="8" w15:restartNumberingAfterBreak="0">
+    <w:nsid w:val="69D67541"/>
+    <w:multiLevelType w:val="multilevel"/>
+    <w:tmpl w:val="1DCEEB30"/>
+    <w:lvl w:ilvl="0">
+      <w:start w:val="3"/>
+      <w:numFmt w:val="decimal"/>
+      <w:lvlText w:val="%1."/>
+      <w:lvlJc w:val="left"/>
+      <w:pPr>
+        <w:tabs>
+          <w:tab w:val="num" w:pos="720"/>
+        </w:tabs>
+        <w:ind w:left="720" w:hanging="360"/>
+      </w:pPr>
+    </w:lvl>
+    <w:lvl w:ilvl="1" w:tentative="1">
+      <w:start w:val="1"/>
+      <w:numFmt w:val="decimal"/>
+      <w:lvlText w:val="%2."/>
+      <w:lvlJc w:val="left"/>
+      <w:pPr>
+        <w:tabs>
+          <w:tab w:val="num" w:pos="1440"/>
+        </w:tabs>
+        <w:ind w:left="1440" w:hanging="360"/>
+      </w:pPr>
+    </w:lvl>
+    <w:lvl w:ilvl="2" w:tentative="1">
+      <w:start w:val="1"/>
+      <w:numFmt w:val="decimal"/>
+      <w:lvlText w:val="%3."/>
+      <w:lvlJc w:val="left"/>
+      <w:pPr>
+        <w:tabs>
+          <w:tab w:val="num" w:pos="2160"/>
+        </w:tabs>
+        <w:ind w:left="2160" w:hanging="360"/>
+      </w:pPr>
+    </w:lvl>
+    <w:lvl w:ilvl="3" w:tentative="1">
+      <w:start w:val="1"/>
+      <w:numFmt w:val="decimal"/>
+      <w:lvlText w:val="%4."/>
+      <w:lvlJc w:val="left"/>
+      <w:pPr>
+        <w:tabs>
+          <w:tab w:val="num" w:pos="2880"/>
+        </w:tabs>
+        <w:ind w:left="2880" w:hanging="360"/>
+      </w:pPr>
+    </w:lvl>
+    <w:lvl w:ilvl="4" w:tentative="1">
+      <w:start w:val="1"/>
+      <w:numFmt w:val="decimal"/>
+      <w:lvlText w:val="%5."/>
+      <w:lvlJc w:val="left"/>
+      <w:pPr>
+        <w:tabs>
+          <w:tab w:val="num" w:pos="3600"/>
+        </w:tabs>
+        <w:ind w:left="3600" w:hanging="360"/>
+      </w:pPr>
+    </w:lvl>
+    <w:lvl w:ilvl="5" w:tentative="1">
+      <w:start w:val="1"/>
+      <w:numFmt w:val="decimal"/>
+      <w:lvlText w:val="%6."/>
+      <w:lvlJc w:val="left"/>
+      <w:pPr>
+        <w:tabs>
+          <w:tab w:val="num" w:pos="4320"/>
+        </w:tabs>
+        <w:ind w:left="4320" w:hanging="360"/>
+      </w:pPr>
+    </w:lvl>
+    <w:lvl w:ilvl="6" w:tentative="1">
+      <w:start w:val="1"/>
+      <w:numFmt w:val="decimal"/>
+      <w:lvlText w:val="%7."/>
+      <w:lvlJc w:val="left"/>
+      <w:pPr>
+        <w:tabs>
+          <w:tab w:val="num" w:pos="5040"/>
+        </w:tabs>
+        <w:ind w:left="5040" w:hanging="360"/>
+      </w:pPr>
+    </w:lvl>
+    <w:lvl w:ilvl="7" w:tentative="1">
+      <w:start w:val="1"/>
+      <w:numFmt w:val="decimal"/>
+      <w:lvlText w:val="%8."/>
+      <w:lvlJc w:val="left"/>
+      <w:pPr>
+        <w:tabs>
+          <w:tab w:val="num" w:pos="5760"/>
+        </w:tabs>
+        <w:ind w:left="5760" w:hanging="360"/>
+      </w:pPr>
+    </w:lvl>
+    <w:lvl w:ilvl="8" w:tentative="1">
+      <w:start w:val="1"/>
+      <w:numFmt w:val="decimal"/>
+      <w:lvlText w:val="%9."/>
+      <w:lvlJc w:val="left"/>
+      <w:pPr>
+        <w:tabs>
+          <w:tab w:val="num" w:pos="6480"/>
+        </w:tabs>
+        <w:ind w:left="6480" w:hanging="360"/>
+      </w:pPr>
+    </w:lvl>
+  </w:abstractNum>
   <w:num w:numId="1" w16cid:durableId="1991664484">
+    <w:abstractNumId w:val="4"/>
+  </w:num>
+  <w:num w:numId="2" w16cid:durableId="140734655">
+    <w:abstractNumId w:val="6"/>
+  </w:num>
+  <w:num w:numId="3" w16cid:durableId="1676806201">
+    <w:abstractNumId w:val="3"/>
+  </w:num>
+  <w:num w:numId="4" w16cid:durableId="333849419">
+    <w:abstractNumId w:val="1"/>
+  </w:num>
+  <w:num w:numId="5" w16cid:durableId="1093278538">
+    <w:abstractNumId w:val="0"/>
+  </w:num>
+  <w:num w:numId="6" w16cid:durableId="1902982386">
     <w:abstractNumId w:val="2"/>
   </w:num>
-  <w:num w:numId="2" w16cid:durableId="140734655">
-    <w:abstractNumId w:val="3"/>
+  <w:num w:numId="7" w16cid:durableId="666788154">
+    <w:abstractNumId w:val="8"/>
   </w:num>
-  <w:num w:numId="3" w16cid:durableId="1676806201">
-    <w:abstractNumId w:val="1"/>
+  <w:num w:numId="8" w16cid:durableId="1776051445">
+    <w:abstractNumId w:val="5"/>
   </w:num>
-  <w:num w:numId="4" w16cid:durableId="333849419">
-    <w:abstractNumId w:val="0"/>
+  <w:num w:numId="9" w16cid:durableId="1455975580">
+    <w:abstractNumId w:val="7"/>
   </w:num>
 </w:numbering>
 </file>
@@ -4134,6 +5497,29 @@
       <w:rFonts w:ascii="Times New Roman" w:hAnsi="Times New Roman" w:cs="Times New Roman"/>
     </w:rPr>
   </w:style>
+  <w:style w:type="character" w:styleId="Hyperlink">
+    <w:name w:val="Hyperlink"/>
+    <w:basedOn w:val="DefaultParagraphFont"/>
+    <w:uiPriority w:val="99"/>
+    <w:unhideWhenUsed/>
+    <w:rsid w:val="00A02920"/>
+    <w:rPr>
+      <w:color w:val="0563C1" w:themeColor="hyperlink"/>
+      <w:u w:val="single"/>
+    </w:rPr>
+  </w:style>
+  <w:style w:type="character" w:styleId="UnresolvedMention">
+    <w:name w:val="Unresolved Mention"/>
+    <w:basedOn w:val="DefaultParagraphFont"/>
+    <w:uiPriority w:val="99"/>
+    <w:semiHidden/>
+    <w:unhideWhenUsed/>
+    <w:rsid w:val="00A02920"/>
+    <w:rPr>
+      <w:color w:val="605E5C"/>
+      <w:shd w:val="clear" w:color="auto" w:fill="E1DFDD"/>
+    </w:rPr>
+  </w:style>
 </w:styles>
 </file>
 

</xml_diff>

<commit_message>
Implemeted 1min candle analytics logic in Flink
</commit_message>
<xml_diff>
--- a/docs/Project Information in detail.docx
+++ b/docs/Project Information in detail.docx
@@ -264,13 +264,8 @@
       </w:pPr>
       <w:r>
         <w:lastRenderedPageBreak/>
-        <w:t xml:space="preserve">In our project we have 3 brokers, with 3 partitions with 3 </w:t>
-      </w:r>
-      <w:proofErr w:type="gramStart"/>
-      <w:r>
-        <w:t>replication</w:t>
-      </w:r>
-      <w:proofErr w:type="gramEnd"/>
+        <w:t>In our project we have 3 brokers, with 3 partitions with 3 replication</w:t>
+      </w:r>
       <w:r>
         <w:br/>
       </w:r>
@@ -400,15 +395,7 @@
     </w:p>
     <w:p>
       <w:r>
-        <w:t xml:space="preserve">Data </w:t>
-      </w:r>
-      <w:proofErr w:type="gramStart"/>
-      <w:r>
-        <w:t>flow</w:t>
-      </w:r>
-      <w:proofErr w:type="gramEnd"/>
-      <w:r>
-        <w:t xml:space="preserve"> into Kafka:</w:t>
+        <w:t>Data flow into Kafka:</w:t>
       </w:r>
     </w:p>
     <w:p>
@@ -501,13 +488,8 @@
         <w:t xml:space="preserve">Kafka topic: </w:t>
       </w:r>
       <w:proofErr w:type="spellStart"/>
-      <w:proofErr w:type="gramStart"/>
-      <w:r>
-        <w:t>coinbase.raw.trade</w:t>
-      </w:r>
-      <w:proofErr w:type="gramEnd"/>
-      <w:r>
-        <w:t>_batches</w:t>
+      <w:r>
+        <w:t>coinbase.raw.trade_batches</w:t>
       </w:r>
       <w:proofErr w:type="spellEnd"/>
     </w:p>
@@ -596,15 +578,7 @@
         </w:numPr>
       </w:pPr>
       <w:r>
-        <w:t xml:space="preserve">The same key consistently goes to the same partition, </w:t>
-      </w:r>
-      <w:proofErr w:type="gramStart"/>
-      <w:r>
-        <w:t>as long as</w:t>
-      </w:r>
-      <w:proofErr w:type="gramEnd"/>
-      <w:r>
-        <w:t xml:space="preserve"> we do not change the partition count.</w:t>
+        <w:t>The same key consistently goes to the same partition, as long as we do not change the partition count.</w:t>
       </w:r>
     </w:p>
     <w:p>
@@ -636,15 +610,7 @@
         <w:t>not</w:t>
       </w:r>
       <w:r>
-        <w:t xml:space="preserve"> manually send records to Kafka </w:t>
-      </w:r>
-      <w:proofErr w:type="gramStart"/>
-      <w:r>
-        <w:t>broker</w:t>
-      </w:r>
-      <w:proofErr w:type="gramEnd"/>
-      <w:r>
-        <w:t xml:space="preserve"> 1, 2, or 3. Kafka handles that.</w:t>
+        <w:t xml:space="preserve"> manually send records to Kafka broker 1, 2, or 3. Kafka handles that.</w:t>
       </w:r>
     </w:p>
     <w:p>
@@ -743,22 +709,12 @@
       </w:r>
     </w:p>
     <w:p>
-      <w:proofErr w:type="gramStart"/>
-      <w:r>
-        <w:t>  Read</w:t>
-      </w:r>
-      <w:proofErr w:type="gramEnd"/>
-      <w:r>
-        <w:t xml:space="preserve"> </w:t>
-      </w:r>
-      <w:proofErr w:type="spellStart"/>
-      <w:proofErr w:type="gramStart"/>
-      <w:r>
-        <w:t>coinbase.raw.trade</w:t>
-      </w:r>
-      <w:proofErr w:type="gramEnd"/>
-      <w:r>
-        <w:t>_batches</w:t>
+      <w:r>
+        <w:t xml:space="preserve">  Read </w:t>
+      </w:r>
+      <w:proofErr w:type="spellStart"/>
+      <w:r>
+        <w:t>coinbase.raw.trade_batches</w:t>
       </w:r>
       <w:proofErr w:type="spellEnd"/>
       <w:r>
@@ -766,70 +722,29 @@
       </w:r>
     </w:p>
     <w:p>
-      <w:proofErr w:type="gramStart"/>
-      <w:r>
-        <w:t>  Parse</w:t>
-      </w:r>
-      <w:proofErr w:type="gramEnd"/>
-      <w:r>
-        <w:t xml:space="preserve"> the raw JSON.</w:t>
-      </w:r>
-    </w:p>
-    <w:p>
-      <w:proofErr w:type="gramStart"/>
-      <w:r>
-        <w:t>  Separate</w:t>
-      </w:r>
-      <w:proofErr w:type="gramEnd"/>
-      <w:r>
-        <w:t xml:space="preserve"> events[</w:t>
-      </w:r>
-      <w:proofErr w:type="gramStart"/>
-      <w:r>
-        <w:t>].trades</w:t>
-      </w:r>
-      <w:proofErr w:type="gramEnd"/>
-      <w:r>
-        <w:t>[] so one Kafka output record represents one trade.</w:t>
-      </w:r>
-    </w:p>
-    <w:p>
-      <w:proofErr w:type="gramStart"/>
+      <w:r>
+        <w:t>  Parse the raw JSON.</w:t>
+      </w:r>
+    </w:p>
+    <w:p>
+      <w:r>
+        <w:t>  Separate events[].trades[] so one Kafka output record represents one trade.</w:t>
+      </w:r>
+    </w:p>
+    <w:p>
       <w:r>
         <w:lastRenderedPageBreak/>
-        <w:t>  Validate</w:t>
-      </w:r>
-      <w:proofErr w:type="gramEnd"/>
-      <w:r>
-        <w:t xml:space="preserve"> required fields and data types.</w:t>
-      </w:r>
-    </w:p>
-    <w:p>
-      <w:proofErr w:type="gramStart"/>
-      <w:r>
-        <w:t>  Convert</w:t>
-      </w:r>
-      <w:proofErr w:type="gramEnd"/>
-      <w:r>
-        <w:t xml:space="preserve"> price and size into precise decimal values and parse trade time.</w:t>
-      </w:r>
-    </w:p>
-    <w:p>
-      <w:proofErr w:type="gramStart"/>
-      <w:r>
-        <w:t>  Add</w:t>
-      </w:r>
-      <w:proofErr w:type="gramEnd"/>
-      <w:r>
-        <w:t xml:space="preserve"> </w:t>
-      </w:r>
-      <w:proofErr w:type="gramStart"/>
-      <w:r>
-        <w:t>useful derived</w:t>
-      </w:r>
-      <w:proofErr w:type="gramEnd"/>
-      <w:r>
-        <w:t xml:space="preserve"> fields such as </w:t>
+        <w:t>  Validate required fields and data types.</w:t>
+      </w:r>
+    </w:p>
+    <w:p>
+      <w:r>
+        <w:t>  Convert price and size into precise decimal values and parse trade time.</w:t>
+      </w:r>
+    </w:p>
+    <w:p>
+      <w:r>
+        <w:t xml:space="preserve">  Add useful derived fields such as </w:t>
       </w:r>
       <w:proofErr w:type="spellStart"/>
       <w:r>
@@ -841,13 +756,8 @@
       </w:r>
     </w:p>
     <w:p>
-      <w:proofErr w:type="gramStart"/>
-      <w:r>
-        <w:t>  Deduplicate</w:t>
-      </w:r>
-      <w:proofErr w:type="gramEnd"/>
-      <w:r>
-        <w:t xml:space="preserve"> using </w:t>
+      <w:r>
+        <w:t xml:space="preserve">  Deduplicate using </w:t>
       </w:r>
       <w:proofErr w:type="spellStart"/>
       <w:r>
@@ -867,22 +777,12 @@
       </w:r>
     </w:p>
     <w:p>
-      <w:proofErr w:type="gramStart"/>
-      <w:r>
-        <w:t>  Publish</w:t>
-      </w:r>
-      <w:proofErr w:type="gramEnd"/>
-      <w:r>
-        <w:t xml:space="preserve"> valid trades to a new Kafka topic: </w:t>
-      </w:r>
-      <w:proofErr w:type="spellStart"/>
-      <w:proofErr w:type="gramStart"/>
-      <w:r>
-        <w:t>coinbase.curated</w:t>
-      </w:r>
-      <w:proofErr w:type="gramEnd"/>
-      <w:r>
-        <w:t>.trades</w:t>
+      <w:r>
+        <w:t xml:space="preserve">  Publish valid trades to a new Kafka topic: </w:t>
+      </w:r>
+      <w:proofErr w:type="spellStart"/>
+      <w:r>
+        <w:t>coinbase.curated.trades</w:t>
       </w:r>
       <w:proofErr w:type="spellEnd"/>
       <w:r>
@@ -890,13 +790,8 @@
       </w:r>
     </w:p>
     <w:p>
-      <w:proofErr w:type="gramStart"/>
-      <w:r>
-        <w:t>  Send</w:t>
-      </w:r>
-      <w:proofErr w:type="gramEnd"/>
-      <w:r>
-        <w:t xml:space="preserve"> malformed/unusable messages to a separate invalid-data topic for investigation.</w:t>
+      <w:r>
+        <w:t>  Send malformed/unusable messages to a separate invalid-data topic for investigation.</w:t>
       </w:r>
     </w:p>
     <w:p/>
@@ -991,33 +886,18 @@
       </w:r>
     </w:p>
     <w:p>
-      <w:proofErr w:type="gramStart"/>
-      <w:r>
-        <w:t>  Spark</w:t>
-      </w:r>
-      <w:proofErr w:type="gramEnd"/>
-      <w:r>
-        <w:t xml:space="preserve"> curation makes the clean trade-level data.</w:t>
-      </w:r>
-    </w:p>
-    <w:p>
-      <w:proofErr w:type="gramStart"/>
-      <w:r>
-        <w:t>  Flink</w:t>
-      </w:r>
-      <w:proofErr w:type="gramEnd"/>
-      <w:r>
-        <w:t xml:space="preserve"> will calculate live metrics from that data: OHLC, VWAP, rolling volume, price changes, volatility, and activity alerts.</w:t>
-      </w:r>
-    </w:p>
-    <w:p>
-      <w:proofErr w:type="gramStart"/>
-      <w:r>
-        <w:t>  MySQL</w:t>
-      </w:r>
-      <w:proofErr w:type="gramEnd"/>
-      <w:r>
-        <w:t xml:space="preserve"> and Grafana will make those calculated metrics visible.</w:t>
+      <w:r>
+        <w:t>  Spark curation makes the clean trade-level data.</w:t>
+      </w:r>
+    </w:p>
+    <w:p>
+      <w:r>
+        <w:t>  Flink will calculate live metrics from that data: OHLC, VWAP, rolling volume, price changes, volatility, and activity alerts.</w:t>
+      </w:r>
+    </w:p>
+    <w:p>
+      <w:r>
+        <w:t>  MySQL and Grafana will make those calculated metrics visible.</w:t>
       </w:r>
     </w:p>
     <w:p>
@@ -1093,13 +973,8 @@
         <w:t xml:space="preserve">Read </w:t>
       </w:r>
       <w:proofErr w:type="spellStart"/>
-      <w:proofErr w:type="gramStart"/>
-      <w:r>
-        <w:t>coinbase.raw.trade</w:t>
-      </w:r>
-      <w:proofErr w:type="gramEnd"/>
-      <w:r>
-        <w:t>_batches</w:t>
+      <w:r>
+        <w:t>coinbase.raw.trade_batches</w:t>
       </w:r>
       <w:proofErr w:type="spellEnd"/>
       <w:r>
@@ -1212,13 +1087,8 @@
         <w:t xml:space="preserve">Write valid records to </w:t>
       </w:r>
       <w:proofErr w:type="spellStart"/>
-      <w:proofErr w:type="gramStart"/>
-      <w:r>
-        <w:t>coinbase.curated</w:t>
-      </w:r>
-      <w:proofErr w:type="gramEnd"/>
-      <w:r>
-        <w:t>.trades</w:t>
+      <w:r>
+        <w:t>coinbase.curated.trades</w:t>
       </w:r>
       <w:proofErr w:type="spellEnd"/>
       <w:r>
@@ -1236,13 +1106,8 @@
         <w:t xml:space="preserve">Write invalid records to </w:t>
       </w:r>
       <w:proofErr w:type="spellStart"/>
-      <w:proofErr w:type="gramStart"/>
-      <w:r>
-        <w:t>coinbase.invalid</w:t>
-      </w:r>
-      <w:proofErr w:type="gramEnd"/>
-      <w:r>
-        <w:t>.trade_batches</w:t>
+      <w:r>
+        <w:t>coinbase.invalid.trade_batches</w:t>
       </w:r>
       <w:proofErr w:type="spellEnd"/>
       <w:r>
@@ -1250,13 +1115,8 @@
       </w:r>
     </w:p>
     <w:p>
-      <w:proofErr w:type="gramStart"/>
-      <w:r>
-        <w:t>  Update</w:t>
-      </w:r>
-      <w:proofErr w:type="gramEnd"/>
-      <w:r>
-        <w:t xml:space="preserve"> Kafka topic initialization to create those two topics </w:t>
+      <w:r>
+        <w:t xml:space="preserve">  Update Kafka topic initialization to create those two topics </w:t>
       </w:r>
     </w:p>
     <w:p>
@@ -1272,13 +1132,8 @@
         <w:t xml:space="preserve"> </w:t>
       </w:r>
       <w:proofErr w:type="spellStart"/>
-      <w:proofErr w:type="gramStart"/>
-      <w:r>
-        <w:t>coinbase.curated</w:t>
-      </w:r>
-      <w:proofErr w:type="gramEnd"/>
-      <w:r>
-        <w:t>.trades</w:t>
+      <w:r>
+        <w:t>coinbase.curated.trades</w:t>
       </w:r>
       <w:proofErr w:type="spellEnd"/>
       <w:r>
@@ -1294,26 +1149,16 @@
         <w:t xml:space="preserve">3 </w:t>
       </w:r>
       <w:r>
-        <w:t xml:space="preserve">replication </w:t>
-      </w:r>
-      <w:proofErr w:type="gramStart"/>
-      <w:r>
-        <w:t>factor</w:t>
-      </w:r>
-      <w:proofErr w:type="gramEnd"/>
+        <w:t>replication factor</w:t>
+      </w:r>
     </w:p>
     <w:p>
       <w:r>
         <w:t xml:space="preserve">and </w:t>
       </w:r>
       <w:proofErr w:type="spellStart"/>
-      <w:proofErr w:type="gramStart"/>
-      <w:r>
-        <w:t>coinbase.invalid</w:t>
-      </w:r>
-      <w:proofErr w:type="gramEnd"/>
-      <w:r>
-        <w:t>.trade_batches</w:t>
+      <w:r>
+        <w:t>coinbase.invalid.trade_batches</w:t>
       </w:r>
       <w:proofErr w:type="spellEnd"/>
       <w:r>
@@ -1328,11 +1173,9 @@
       <w:r>
         <w:t xml:space="preserve">2 </w:t>
       </w:r>
-      <w:proofErr w:type="gramStart"/>
       <w:r>
         <w:t>replication</w:t>
       </w:r>
-      <w:proofErr w:type="gramEnd"/>
     </w:p>
     <w:p>
       <w:r>
@@ -1386,15 +1229,7 @@
     </w:p>
     <w:p>
       <w:r>
-        <w:t xml:space="preserve">That is how Spark </w:t>
-      </w:r>
-      <w:proofErr w:type="gramStart"/>
-      <w:r>
-        <w:t>processing</w:t>
-      </w:r>
-      <w:proofErr w:type="gramEnd"/>
-      <w:r>
-        <w:t xml:space="preserve"> capacity scales. We currently use one worker with 2 CPU cores and 2 GB memory, which is enough for this local project stage.</w:t>
+        <w:t>That is how Spark processing capacity scales. We currently use one worker with 2 CPU cores and 2 GB memory, which is enough for this local project stage.</w:t>
       </w:r>
       <w:r>
         <w:t xml:space="preserve"> </w:t>
@@ -1434,15 +1269,7 @@
     <w:p/>
     <w:p>
       <w:r>
-        <w:t xml:space="preserve">This is how our Curated </w:t>
-      </w:r>
-      <w:proofErr w:type="gramStart"/>
-      <w:r>
-        <w:t>data are</w:t>
-      </w:r>
-      <w:proofErr w:type="gramEnd"/>
-      <w:r>
-        <w:t xml:space="preserve"> looks like in </w:t>
+        <w:t xml:space="preserve">This is how our Curated data are looks like in </w:t>
       </w:r>
       <w:proofErr w:type="spellStart"/>
       <w:r>
@@ -1482,26 +1309,16 @@
     </w:p>
     <w:p>
       <w:r>
-        <w:t xml:space="preserve">    "payload</w:t>
-      </w:r>
-      <w:proofErr w:type="gramStart"/>
-      <w:r>
-        <w:t>": {</w:t>
-      </w:r>
-      <w:proofErr w:type="gramEnd"/>
+        <w:t xml:space="preserve">    "payload": {</w:t>
+      </w:r>
     </w:p>
     <w:p>
       <w:r>
         <w:t xml:space="preserve">      "</w:t>
       </w:r>
       <w:proofErr w:type="spellStart"/>
-      <w:proofErr w:type="gramStart"/>
-      <w:r>
-        <w:t>product</w:t>
-      </w:r>
-      <w:proofErr w:type="gramEnd"/>
-      <w:r>
-        <w:t>_id</w:t>
+      <w:r>
+        <w:t>product_id</w:t>
       </w:r>
       <w:proofErr w:type="spellEnd"/>
       <w:r>
@@ -1513,13 +1330,8 @@
         <w:t xml:space="preserve">      "</w:t>
       </w:r>
       <w:proofErr w:type="spellStart"/>
-      <w:proofErr w:type="gramStart"/>
-      <w:r>
-        <w:t>trade</w:t>
-      </w:r>
-      <w:proofErr w:type="gramEnd"/>
-      <w:r>
-        <w:t>_id</w:t>
+      <w:r>
+        <w:t>trade_id</w:t>
       </w:r>
       <w:proofErr w:type="spellEnd"/>
       <w:r>
@@ -1531,13 +1343,8 @@
         <w:t xml:space="preserve">      "</w:t>
       </w:r>
       <w:proofErr w:type="spellStart"/>
-      <w:proofErr w:type="gramStart"/>
-      <w:r>
-        <w:t>trade</w:t>
-      </w:r>
-      <w:proofErr w:type="gramEnd"/>
-      <w:r>
-        <w:t>_time</w:t>
+      <w:r>
+        <w:t>trade_time</w:t>
       </w:r>
       <w:proofErr w:type="spellEnd"/>
       <w:r>
@@ -1559,13 +1366,8 @@
         <w:t xml:space="preserve">      "</w:t>
       </w:r>
       <w:proofErr w:type="spellStart"/>
-      <w:proofErr w:type="gramStart"/>
-      <w:r>
-        <w:t>notional</w:t>
-      </w:r>
-      <w:proofErr w:type="gramEnd"/>
-      <w:r>
-        <w:t>_usd</w:t>
+      <w:r>
+        <w:t>notional_usd</w:t>
       </w:r>
       <w:proofErr w:type="spellEnd"/>
       <w:r>
@@ -1583,13 +1385,8 @@
         <w:t xml:space="preserve">      "</w:t>
       </w:r>
       <w:proofErr w:type="spellStart"/>
-      <w:proofErr w:type="gramStart"/>
-      <w:r>
-        <w:t>batch</w:t>
-      </w:r>
-      <w:proofErr w:type="gramEnd"/>
-      <w:r>
-        <w:t>_timestamp</w:t>
+      <w:r>
+        <w:t>batch_timestamp</w:t>
       </w:r>
       <w:proofErr w:type="spellEnd"/>
       <w:r>
@@ -1601,13 +1398,8 @@
         <w:t xml:space="preserve">      "</w:t>
       </w:r>
       <w:proofErr w:type="spellStart"/>
-      <w:proofErr w:type="gramStart"/>
-      <w:r>
-        <w:t>sequence</w:t>
-      </w:r>
-      <w:proofErr w:type="gramEnd"/>
-      <w:r>
-        <w:t>_num</w:t>
+      <w:r>
+        <w:t>sequence_num</w:t>
       </w:r>
       <w:proofErr w:type="spellEnd"/>
       <w:r>
@@ -1619,13 +1411,8 @@
         <w:t xml:space="preserve">      "</w:t>
       </w:r>
       <w:proofErr w:type="spellStart"/>
-      <w:proofErr w:type="gramStart"/>
-      <w:r>
-        <w:t>event</w:t>
-      </w:r>
-      <w:proofErr w:type="gramEnd"/>
-      <w:r>
-        <w:t>_type</w:t>
+      <w:r>
+        <w:t>event_type</w:t>
       </w:r>
       <w:proofErr w:type="spellEnd"/>
       <w:r>
@@ -1637,26 +1424,16 @@
         <w:t xml:space="preserve">      "</w:t>
       </w:r>
       <w:proofErr w:type="spellStart"/>
-      <w:proofErr w:type="gramStart"/>
-      <w:r>
-        <w:t>kafka</w:t>
-      </w:r>
-      <w:proofErr w:type="gramEnd"/>
-      <w:r>
-        <w:t>_topic</w:t>
+      <w:r>
+        <w:t>kafka_topic</w:t>
       </w:r>
       <w:proofErr w:type="spellEnd"/>
       <w:r>
         <w:t>": "</w:t>
       </w:r>
       <w:proofErr w:type="spellStart"/>
-      <w:proofErr w:type="gramStart"/>
-      <w:r>
-        <w:t>coinbase.raw.trade</w:t>
-      </w:r>
-      <w:proofErr w:type="gramEnd"/>
-      <w:r>
-        <w:t>_batches</w:t>
+      <w:r>
+        <w:t>coinbase.raw.trade_batches</w:t>
       </w:r>
       <w:proofErr w:type="spellEnd"/>
       <w:r>
@@ -1668,13 +1445,8 @@
         <w:t xml:space="preserve">      "</w:t>
       </w:r>
       <w:proofErr w:type="spellStart"/>
-      <w:proofErr w:type="gramStart"/>
-      <w:r>
-        <w:t>kafka</w:t>
-      </w:r>
-      <w:proofErr w:type="gramEnd"/>
-      <w:r>
-        <w:t>_partition</w:t>
+      <w:r>
+        <w:t>kafka_partition</w:t>
       </w:r>
       <w:proofErr w:type="spellEnd"/>
       <w:r>
@@ -1686,13 +1458,8 @@
         <w:t xml:space="preserve">      "</w:t>
       </w:r>
       <w:proofErr w:type="spellStart"/>
-      <w:proofErr w:type="gramStart"/>
-      <w:r>
-        <w:t>kafka</w:t>
-      </w:r>
-      <w:proofErr w:type="gramEnd"/>
-      <w:r>
-        <w:t>_offset</w:t>
+      <w:r>
+        <w:t>kafka_offset</w:t>
       </w:r>
       <w:proofErr w:type="spellEnd"/>
       <w:r>
@@ -1704,13 +1471,8 @@
         <w:t xml:space="preserve">      "</w:t>
       </w:r>
       <w:proofErr w:type="spellStart"/>
-      <w:proofErr w:type="gramStart"/>
-      <w:r>
-        <w:t>kafka</w:t>
-      </w:r>
-      <w:proofErr w:type="gramEnd"/>
-      <w:r>
-        <w:t>_received_at</w:t>
+      <w:r>
+        <w:t>kafka_received_at</w:t>
       </w:r>
       <w:proofErr w:type="spellEnd"/>
       <w:r>
@@ -1722,13 +1484,8 @@
         <w:t xml:space="preserve">      "</w:t>
       </w:r>
       <w:proofErr w:type="spellStart"/>
-      <w:proofErr w:type="gramStart"/>
-      <w:r>
-        <w:t>curated</w:t>
-      </w:r>
-      <w:proofErr w:type="gramEnd"/>
-      <w:r>
-        <w:t>_at</w:t>
+      <w:r>
+        <w:t>curated_at</w:t>
       </w:r>
       <w:proofErr w:type="spellEnd"/>
       <w:r>
@@ -1767,26 +1524,16 @@
     </w:p>
     <w:p>
       <w:r>
-        <w:t xml:space="preserve">    "payload</w:t>
-      </w:r>
-      <w:proofErr w:type="gramStart"/>
-      <w:r>
-        <w:t>": {</w:t>
-      </w:r>
-      <w:proofErr w:type="gramEnd"/>
+        <w:t xml:space="preserve">    "payload": {</w:t>
+      </w:r>
     </w:p>
     <w:p>
       <w:r>
         <w:t xml:space="preserve">      "</w:t>
       </w:r>
       <w:proofErr w:type="spellStart"/>
-      <w:proofErr w:type="gramStart"/>
-      <w:r>
-        <w:t>product</w:t>
-      </w:r>
-      <w:proofErr w:type="gramEnd"/>
-      <w:r>
-        <w:t>_id</w:t>
+      <w:r>
+        <w:t>product_id</w:t>
       </w:r>
       <w:proofErr w:type="spellEnd"/>
       <w:r>
@@ -1798,13 +1545,8 @@
         <w:t xml:space="preserve">      "</w:t>
       </w:r>
       <w:proofErr w:type="spellStart"/>
-      <w:proofErr w:type="gramStart"/>
-      <w:r>
-        <w:t>trade</w:t>
-      </w:r>
-      <w:proofErr w:type="gramEnd"/>
-      <w:r>
-        <w:t>_id</w:t>
+      <w:r>
+        <w:t>trade_id</w:t>
       </w:r>
       <w:proofErr w:type="spellEnd"/>
       <w:r>
@@ -1816,13 +1558,8 @@
         <w:t xml:space="preserve">      "</w:t>
       </w:r>
       <w:proofErr w:type="spellStart"/>
-      <w:proofErr w:type="gramStart"/>
-      <w:r>
-        <w:t>trade</w:t>
-      </w:r>
-      <w:proofErr w:type="gramEnd"/>
-      <w:r>
-        <w:t>_time</w:t>
+      <w:r>
+        <w:t>trade_time</w:t>
       </w:r>
       <w:proofErr w:type="spellEnd"/>
       <w:r>
@@ -1844,13 +1581,8 @@
         <w:t xml:space="preserve">      "</w:t>
       </w:r>
       <w:proofErr w:type="spellStart"/>
-      <w:proofErr w:type="gramStart"/>
-      <w:r>
-        <w:t>notional</w:t>
-      </w:r>
-      <w:proofErr w:type="gramEnd"/>
-      <w:r>
-        <w:t>_usd</w:t>
+      <w:r>
+        <w:t>notional_usd</w:t>
       </w:r>
       <w:proofErr w:type="spellEnd"/>
       <w:r>
@@ -1867,13 +1599,8 @@
         <w:t xml:space="preserve">      "</w:t>
       </w:r>
       <w:proofErr w:type="spellStart"/>
-      <w:proofErr w:type="gramStart"/>
-      <w:r>
-        <w:t>batch</w:t>
-      </w:r>
-      <w:proofErr w:type="gramEnd"/>
-      <w:r>
-        <w:t>_timestamp</w:t>
+      <w:r>
+        <w:t>batch_timestamp</w:t>
       </w:r>
       <w:proofErr w:type="spellEnd"/>
       <w:r>
@@ -1885,13 +1612,8 @@
         <w:t xml:space="preserve">      "</w:t>
       </w:r>
       <w:proofErr w:type="spellStart"/>
-      <w:proofErr w:type="gramStart"/>
-      <w:r>
-        <w:t>sequence</w:t>
-      </w:r>
-      <w:proofErr w:type="gramEnd"/>
-      <w:r>
-        <w:t>_num</w:t>
+      <w:r>
+        <w:t>sequence_num</w:t>
       </w:r>
       <w:proofErr w:type="spellEnd"/>
       <w:r>
@@ -1903,13 +1625,8 @@
         <w:t xml:space="preserve">      "</w:t>
       </w:r>
       <w:proofErr w:type="spellStart"/>
-      <w:proofErr w:type="gramStart"/>
-      <w:r>
-        <w:t>event</w:t>
-      </w:r>
-      <w:proofErr w:type="gramEnd"/>
-      <w:r>
-        <w:t>_type</w:t>
+      <w:r>
+        <w:t>event_type</w:t>
       </w:r>
       <w:proofErr w:type="spellEnd"/>
       <w:r>
@@ -1922,26 +1639,16 @@
         <w:t xml:space="preserve">      "</w:t>
       </w:r>
       <w:proofErr w:type="spellStart"/>
-      <w:proofErr w:type="gramStart"/>
-      <w:r>
-        <w:t>kafka</w:t>
-      </w:r>
-      <w:proofErr w:type="gramEnd"/>
-      <w:r>
-        <w:t>_topic</w:t>
+      <w:r>
+        <w:t>kafka_topic</w:t>
       </w:r>
       <w:proofErr w:type="spellEnd"/>
       <w:r>
         <w:t>": "</w:t>
       </w:r>
       <w:proofErr w:type="spellStart"/>
-      <w:proofErr w:type="gramStart"/>
-      <w:r>
-        <w:t>coinbase.raw.trade</w:t>
-      </w:r>
-      <w:proofErr w:type="gramEnd"/>
-      <w:r>
-        <w:t>_batches</w:t>
+      <w:r>
+        <w:t>coinbase.raw.trade_batches</w:t>
       </w:r>
       <w:proofErr w:type="spellEnd"/>
       <w:r>
@@ -1953,13 +1660,8 @@
         <w:t xml:space="preserve">      "</w:t>
       </w:r>
       <w:proofErr w:type="spellStart"/>
-      <w:proofErr w:type="gramStart"/>
-      <w:r>
-        <w:t>kafka</w:t>
-      </w:r>
-      <w:proofErr w:type="gramEnd"/>
-      <w:r>
-        <w:t>_partition</w:t>
+      <w:r>
+        <w:t>kafka_partition</w:t>
       </w:r>
       <w:proofErr w:type="spellEnd"/>
       <w:r>
@@ -1971,13 +1673,8 @@
         <w:t xml:space="preserve">      "</w:t>
       </w:r>
       <w:proofErr w:type="spellStart"/>
-      <w:proofErr w:type="gramStart"/>
-      <w:r>
-        <w:t>kafka</w:t>
-      </w:r>
-      <w:proofErr w:type="gramEnd"/>
-      <w:r>
-        <w:t>_offset</w:t>
+      <w:r>
+        <w:t>kafka_offset</w:t>
       </w:r>
       <w:proofErr w:type="spellEnd"/>
       <w:r>
@@ -1989,13 +1686,8 @@
         <w:t xml:space="preserve">      "</w:t>
       </w:r>
       <w:proofErr w:type="spellStart"/>
-      <w:proofErr w:type="gramStart"/>
-      <w:r>
-        <w:t>kafka</w:t>
-      </w:r>
-      <w:proofErr w:type="gramEnd"/>
-      <w:r>
-        <w:t>_received_at</w:t>
+      <w:r>
+        <w:t>kafka_received_at</w:t>
       </w:r>
       <w:proofErr w:type="spellEnd"/>
       <w:r>
@@ -2007,13 +1699,8 @@
         <w:t xml:space="preserve">      "</w:t>
       </w:r>
       <w:proofErr w:type="spellStart"/>
-      <w:proofErr w:type="gramStart"/>
-      <w:r>
-        <w:t>curated</w:t>
-      </w:r>
-      <w:proofErr w:type="gramEnd"/>
-      <w:r>
-        <w:t>_at</w:t>
+      <w:r>
+        <w:t>curated_at</w:t>
       </w:r>
       <w:proofErr w:type="spellEnd"/>
       <w:r>
@@ -2052,26 +1739,16 @@
     </w:p>
     <w:p>
       <w:r>
-        <w:t xml:space="preserve">    "payload</w:t>
-      </w:r>
-      <w:proofErr w:type="gramStart"/>
-      <w:r>
-        <w:t>": {</w:t>
-      </w:r>
-      <w:proofErr w:type="gramEnd"/>
+        <w:t xml:space="preserve">    "payload": {</w:t>
+      </w:r>
     </w:p>
     <w:p>
       <w:r>
         <w:t xml:space="preserve">      "</w:t>
       </w:r>
       <w:proofErr w:type="spellStart"/>
-      <w:proofErr w:type="gramStart"/>
-      <w:r>
-        <w:t>product</w:t>
-      </w:r>
-      <w:proofErr w:type="gramEnd"/>
-      <w:r>
-        <w:t>_id</w:t>
+      <w:r>
+        <w:t>product_id</w:t>
       </w:r>
       <w:proofErr w:type="spellEnd"/>
       <w:r>
@@ -2083,13 +1760,8 @@
         <w:t xml:space="preserve">      "</w:t>
       </w:r>
       <w:proofErr w:type="spellStart"/>
-      <w:proofErr w:type="gramStart"/>
-      <w:r>
-        <w:t>trade</w:t>
-      </w:r>
-      <w:proofErr w:type="gramEnd"/>
-      <w:r>
-        <w:t>_id</w:t>
+      <w:r>
+        <w:t>trade_id</w:t>
       </w:r>
       <w:proofErr w:type="spellEnd"/>
       <w:r>
@@ -2101,13 +1773,8 @@
         <w:t xml:space="preserve">      "</w:t>
       </w:r>
       <w:proofErr w:type="spellStart"/>
-      <w:proofErr w:type="gramStart"/>
-      <w:r>
-        <w:t>trade</w:t>
-      </w:r>
-      <w:proofErr w:type="gramEnd"/>
-      <w:r>
-        <w:t>_time</w:t>
+      <w:r>
+        <w:t>trade_time</w:t>
       </w:r>
       <w:proofErr w:type="spellEnd"/>
       <w:r>
@@ -2129,13 +1796,8 @@
         <w:t xml:space="preserve">      "</w:t>
       </w:r>
       <w:proofErr w:type="spellStart"/>
-      <w:proofErr w:type="gramStart"/>
-      <w:r>
-        <w:t>notional</w:t>
-      </w:r>
-      <w:proofErr w:type="gramEnd"/>
-      <w:r>
-        <w:t>_usd</w:t>
+      <w:r>
+        <w:t>notional_usd</w:t>
       </w:r>
       <w:proofErr w:type="spellEnd"/>
       <w:r>
@@ -2152,13 +1814,8 @@
         <w:t xml:space="preserve">      "</w:t>
       </w:r>
       <w:proofErr w:type="spellStart"/>
-      <w:proofErr w:type="gramStart"/>
-      <w:r>
-        <w:t>batch</w:t>
-      </w:r>
-      <w:proofErr w:type="gramEnd"/>
-      <w:r>
-        <w:t>_timestamp</w:t>
+      <w:r>
+        <w:t>batch_timestamp</w:t>
       </w:r>
       <w:proofErr w:type="spellEnd"/>
       <w:r>
@@ -2170,13 +1827,8 @@
         <w:t xml:space="preserve">      "</w:t>
       </w:r>
       <w:proofErr w:type="spellStart"/>
-      <w:proofErr w:type="gramStart"/>
-      <w:r>
-        <w:t>sequence</w:t>
-      </w:r>
-      <w:proofErr w:type="gramEnd"/>
-      <w:r>
-        <w:t>_num</w:t>
+      <w:r>
+        <w:t>sequence_num</w:t>
       </w:r>
       <w:proofErr w:type="spellEnd"/>
       <w:r>
@@ -2188,13 +1840,8 @@
         <w:t xml:space="preserve">      "</w:t>
       </w:r>
       <w:proofErr w:type="spellStart"/>
-      <w:proofErr w:type="gramStart"/>
-      <w:r>
-        <w:t>event</w:t>
-      </w:r>
-      <w:proofErr w:type="gramEnd"/>
-      <w:r>
-        <w:t>_type</w:t>
+      <w:r>
+        <w:t>event_type</w:t>
       </w:r>
       <w:proofErr w:type="spellEnd"/>
       <w:r>
@@ -2206,26 +1853,16 @@
         <w:t xml:space="preserve">      "</w:t>
       </w:r>
       <w:proofErr w:type="spellStart"/>
-      <w:proofErr w:type="gramStart"/>
-      <w:r>
-        <w:t>kafka</w:t>
-      </w:r>
-      <w:proofErr w:type="gramEnd"/>
-      <w:r>
-        <w:t>_topic</w:t>
+      <w:r>
+        <w:t>kafka_topic</w:t>
       </w:r>
       <w:proofErr w:type="spellEnd"/>
       <w:r>
         <w:t>": "</w:t>
       </w:r>
       <w:proofErr w:type="spellStart"/>
-      <w:proofErr w:type="gramStart"/>
-      <w:r>
-        <w:t>coinbase.raw.trade</w:t>
-      </w:r>
-      <w:proofErr w:type="gramEnd"/>
-      <w:r>
-        <w:t>_batches</w:t>
+      <w:r>
+        <w:t>coinbase.raw.trade_batches</w:t>
       </w:r>
       <w:proofErr w:type="spellEnd"/>
       <w:r>
@@ -2237,13 +1874,8 @@
         <w:t xml:space="preserve">      "</w:t>
       </w:r>
       <w:proofErr w:type="spellStart"/>
-      <w:proofErr w:type="gramStart"/>
-      <w:r>
-        <w:t>kafka</w:t>
-      </w:r>
-      <w:proofErr w:type="gramEnd"/>
-      <w:r>
-        <w:t>_partition</w:t>
+      <w:r>
+        <w:t>kafka_partition</w:t>
       </w:r>
       <w:proofErr w:type="spellEnd"/>
       <w:r>
@@ -2255,13 +1887,8 @@
         <w:t xml:space="preserve">      "</w:t>
       </w:r>
       <w:proofErr w:type="spellStart"/>
-      <w:proofErr w:type="gramStart"/>
-      <w:r>
-        <w:t>kafka</w:t>
-      </w:r>
-      <w:proofErr w:type="gramEnd"/>
-      <w:r>
-        <w:t>_offset</w:t>
+      <w:r>
+        <w:t>kafka_offset</w:t>
       </w:r>
       <w:proofErr w:type="spellEnd"/>
       <w:r>
@@ -2273,13 +1900,8 @@
         <w:t xml:space="preserve">      "</w:t>
       </w:r>
       <w:proofErr w:type="spellStart"/>
-      <w:proofErr w:type="gramStart"/>
-      <w:r>
-        <w:t>kafka</w:t>
-      </w:r>
-      <w:proofErr w:type="gramEnd"/>
-      <w:r>
-        <w:t>_received_at</w:t>
+      <w:r>
+        <w:t>kafka_received_at</w:t>
       </w:r>
       <w:proofErr w:type="spellEnd"/>
       <w:r>
@@ -2292,13 +1914,8 @@
         <w:t xml:space="preserve">      "</w:t>
       </w:r>
       <w:proofErr w:type="spellStart"/>
-      <w:proofErr w:type="gramStart"/>
-      <w:r>
-        <w:t>curated</w:t>
-      </w:r>
-      <w:proofErr w:type="gramEnd"/>
-      <w:r>
-        <w:t>_at</w:t>
+      <w:r>
+        <w:t>curated_at</w:t>
       </w:r>
       <w:proofErr w:type="spellEnd"/>
       <w:r>
@@ -2718,8 +2335,6 @@
       </w:r>
       <w:r>
         <w:br/>
-      </w:r>
-      <w:r>
         <w:t xml:space="preserve">Example OHLC Candle Dashboard - </w:t>
       </w:r>
       <w:hyperlink r:id="rId10" w:history="1">
@@ -2805,6 +2420,9 @@
     <w:p/>
     <w:p>
       <w:r>
+        <w:rPr>
+          <w:noProof/>
+        </w:rPr>
         <w:drawing>
           <wp:inline distT="0" distB="0" distL="0" distR="0" wp14:anchorId="40FE5307" wp14:editId="01BD6332">
             <wp:extent cx="5943600" cy="2226310"/>
@@ -2897,6 +2515,9 @@
     </w:p>
     <w:p>
       <w:r>
+        <w:rPr>
+          <w:noProof/>
+        </w:rPr>
         <w:drawing>
           <wp:inline distT="0" distB="0" distL="0" distR="0" wp14:anchorId="10B941E4" wp14:editId="13D89DAC">
             <wp:extent cx="5943600" cy="3646170"/>
@@ -2953,15 +2574,7 @@
     </w:p>
     <w:p>
       <w:r>
-        <w:t xml:space="preserve">1 - It is possible that two windows </w:t>
-      </w:r>
-      <w:proofErr w:type="gramStart"/>
-      <w:r>
-        <w:t>remains</w:t>
-      </w:r>
-      <w:proofErr w:type="gramEnd"/>
-      <w:r>
-        <w:t xml:space="preserve"> open</w:t>
+        <w:t>1 - It is possible that two windows remains open</w:t>
       </w:r>
       <w:r>
         <w:br/>
@@ -2987,15 +2600,7 @@
       </w:r>
       <w:r>
         <w:br/>
-        <w:t xml:space="preserve">Window: [12:01:00, 12:02:00) - will eventually </w:t>
-      </w:r>
-      <w:proofErr w:type="gramStart"/>
-      <w:r>
-        <w:t>lends</w:t>
-      </w:r>
-      <w:proofErr w:type="gramEnd"/>
-      <w:r>
-        <w:t xml:space="preserve"> here.</w:t>
+        <w:t>Window: [12:01:00, 12:02:00) - will eventually lends here.</w:t>
       </w:r>
     </w:p>
     <w:p>
@@ -3008,14 +2613,9 @@
       </w:r>
     </w:p>
     <w:p>
-      <w:proofErr w:type="gramStart"/>
       <w:r>
         <w:lastRenderedPageBreak/>
-        <w:t>so</w:t>
-      </w:r>
-      <w:proofErr w:type="gramEnd"/>
-      <w:r>
-        <w:t xml:space="preserve"> it only decides when to close the window and not which record will lend in which window or anything.</w:t>
+        <w:t>so it only decides when to close the window and not which record will lend in which window or anything.</w:t>
       </w:r>
     </w:p>
     <w:p>
@@ -3028,23 +2628,13 @@
       </w:r>
       <w:proofErr w:type="spellEnd"/>
       <w:r>
-        <w:t xml:space="preserve"> leap between 2 consecutive records </w:t>
-      </w:r>
-      <w:proofErr w:type="gramStart"/>
-      <w:r>
-        <w:t>are</w:t>
-      </w:r>
-      <w:proofErr w:type="gramEnd"/>
-      <w:r>
-        <w:t xml:space="preserve"> large then the previous window will shut early - because that watermark after </w:t>
-      </w:r>
-      <w:proofErr w:type="spellStart"/>
-      <w:proofErr w:type="gramStart"/>
+        <w:t xml:space="preserve"> leap between 2 consecutive records are large then the previous window will shut early - because that watermark after </w:t>
+      </w:r>
+      <w:proofErr w:type="spellStart"/>
       <w:r>
         <w:t>substracting</w:t>
       </w:r>
       <w:proofErr w:type="spellEnd"/>
-      <w:proofErr w:type="gramEnd"/>
       <w:r>
         <w:t xml:space="preserve"> 30 from the trade time also comes closer to 12:00:59.99 very fast.</w:t>
       </w:r>
@@ -3059,31 +2649,7 @@
       </w:r>
       <w:proofErr w:type="spellEnd"/>
       <w:r>
-        <w:t xml:space="preserve"> leap between 2 consecutive records </w:t>
-      </w:r>
-      <w:proofErr w:type="gramStart"/>
-      <w:r>
-        <w:t>are</w:t>
-      </w:r>
-      <w:proofErr w:type="gramEnd"/>
-      <w:r>
-        <w:t xml:space="preserve"> small (for e.g. 1-1 second) then the previous window stays open for longer </w:t>
-      </w:r>
-      <w:proofErr w:type="gramStart"/>
-      <w:r>
-        <w:t>period of time</w:t>
-      </w:r>
-      <w:proofErr w:type="gramEnd"/>
-      <w:r>
-        <w:t xml:space="preserve"> - because watermark comes closer to 12:00:59.99 very slow (after roughly 1 -1 second). Allows more time to the older records which belongs might </w:t>
-      </w:r>
-      <w:proofErr w:type="gramStart"/>
-      <w:r>
-        <w:t>belongs</w:t>
-      </w:r>
-      <w:proofErr w:type="gramEnd"/>
-      <w:r>
-        <w:t xml:space="preserve"> to the previous window.</w:t>
+        <w:t xml:space="preserve"> leap between 2 consecutive records are small (for e.g. 1-1 second) then the previous window stays open for longer period of time - because watermark comes closer to 12:00:59.99 very slow (after roughly 1 -1 second). Allows more time to the older records which belongs might belongs to the previous window.</w:t>
       </w:r>
     </w:p>
     <w:p/>
@@ -3115,23 +2681,7 @@
     </w:p>
     <w:p>
       <w:r>
-        <w:t xml:space="preserve">With one-minute windows and a 30-second watermark delay, it is common for the </w:t>
-      </w:r>
-      <w:proofErr w:type="gramStart"/>
-      <w:r>
-        <w:t>current minute</w:t>
-      </w:r>
-      <w:proofErr w:type="gramEnd"/>
-      <w:r>
-        <w:t xml:space="preserve"> and previous minute </w:t>
-      </w:r>
-      <w:proofErr w:type="gramStart"/>
-      <w:r>
-        <w:t>to both</w:t>
-      </w:r>
-      <w:proofErr w:type="gramEnd"/>
-      <w:r>
-        <w:t xml:space="preserve"> remain open.</w:t>
+        <w:t>With one-minute windows and a 30-second watermark delay, it is common for the current minute and previous minute to both remain open.</w:t>
       </w:r>
     </w:p>
     <w:p>
@@ -3162,15 +2712,7 @@
     </w:p>
     <w:p>
       <w:r>
-        <w:t xml:space="preserve">In unusual </w:t>
-      </w:r>
-      <w:proofErr w:type="gramStart"/>
-      <w:r>
-        <w:t>cases—slow partitions</w:t>
-      </w:r>
-      <w:proofErr w:type="gramEnd"/>
-      <w:r>
-        <w:t>, idle-input handling, or a larger watermark delay—more than two windows may remain open.</w:t>
+        <w:t>In unusual cases—slow partitions, idle-input handling, or a larger watermark delay—more than two windows may remain open.</w:t>
       </w:r>
     </w:p>
     <w:p>
@@ -3380,15 +2922,324 @@
           <w:szCs w:val="32"/>
         </w:rPr>
       </w:pPr>
-    </w:p>
-    <w:p>
-      <w:pPr>
+      <w:r>
         <w:rPr>
           <w:sz w:val="32"/>
           <w:szCs w:val="32"/>
         </w:rPr>
-      </w:pPr>
-    </w:p>
+        <w:t>Flink Implementation logic:</w:t>
+      </w:r>
+      <w:r>
+        <w:rPr>
+          <w:sz w:val="32"/>
+          <w:szCs w:val="32"/>
+        </w:rPr>
+        <w:br/>
+      </w:r>
+    </w:p>
+    <w:p>
+      <w:r>
+        <w:t>At the time of implementation stage we have:</w:t>
+      </w:r>
+      <w:r>
+        <w:br/>
+      </w:r>
+      <w:r>
+        <w:drawing>
+          <wp:inline distT="0" distB="0" distL="0" distR="0" wp14:anchorId="3B5DE53C" wp14:editId="1C300305">
+            <wp:extent cx="1348857" cy="891617"/>
+            <wp:effectExtent l="0" t="0" r="3810" b="3810"/>
+            <wp:docPr id="1420485942" name="Picture 1"/>
+            <wp:cNvGraphicFramePr>
+              <a:graphicFrameLocks xmlns:a="http://schemas.openxmlformats.org/drawingml/2006/main" noChangeAspect="1"/>
+            </wp:cNvGraphicFramePr>
+            <a:graphic xmlns:a="http://schemas.openxmlformats.org/drawingml/2006/main">
+              <a:graphicData uri="http://schemas.openxmlformats.org/drawingml/2006/picture">
+                <pic:pic xmlns:pic="http://schemas.openxmlformats.org/drawingml/2006/picture">
+                  <pic:nvPicPr>
+                    <pic:cNvPr id="1420485942" name=""/>
+                    <pic:cNvPicPr/>
+                  </pic:nvPicPr>
+                  <pic:blipFill>
+                    <a:blip r:embed="rId14"/>
+                    <a:stretch>
+                      <a:fillRect/>
+                    </a:stretch>
+                  </pic:blipFill>
+                  <pic:spPr>
+                    <a:xfrm>
+                      <a:off x="0" y="0"/>
+                      <a:ext cx="1348857" cy="891617"/>
+                    </a:xfrm>
+                    <a:prstGeom prst="rect">
+                      <a:avLst/>
+                    </a:prstGeom>
+                  </pic:spPr>
+                </pic:pic>
+              </a:graphicData>
+            </a:graphic>
+          </wp:inline>
+        </w:drawing>
+      </w:r>
+    </w:p>
+    <w:p>
+      <w:r>
+        <w:t>Later we will add more Job manager.</w:t>
+      </w:r>
+    </w:p>
+    <w:p>
+      <w:r>
+        <w:t>With this we have 2 parallelism</w:t>
+      </w:r>
+    </w:p>
+    <w:p>
+      <w:r>
+        <w:drawing>
+          <wp:inline distT="0" distB="0" distL="0" distR="0" wp14:anchorId="3E1F345F" wp14:editId="4E28F16F">
+            <wp:extent cx="2446232" cy="2034716"/>
+            <wp:effectExtent l="0" t="0" r="0" b="3810"/>
+            <wp:docPr id="7305980" name="Picture 1"/>
+            <wp:cNvGraphicFramePr>
+              <a:graphicFrameLocks xmlns:a="http://schemas.openxmlformats.org/drawingml/2006/main" noChangeAspect="1"/>
+            </wp:cNvGraphicFramePr>
+            <a:graphic xmlns:a="http://schemas.openxmlformats.org/drawingml/2006/main">
+              <a:graphicData uri="http://schemas.openxmlformats.org/drawingml/2006/picture">
+                <pic:pic xmlns:pic="http://schemas.openxmlformats.org/drawingml/2006/picture">
+                  <pic:nvPicPr>
+                    <pic:cNvPr id="7305980" name=""/>
+                    <pic:cNvPicPr/>
+                  </pic:nvPicPr>
+                  <pic:blipFill>
+                    <a:blip r:embed="rId15"/>
+                    <a:stretch>
+                      <a:fillRect/>
+                    </a:stretch>
+                  </pic:blipFill>
+                  <pic:spPr>
+                    <a:xfrm>
+                      <a:off x="0" y="0"/>
+                      <a:ext cx="2446232" cy="2034716"/>
+                    </a:xfrm>
+                    <a:prstGeom prst="rect">
+                      <a:avLst/>
+                    </a:prstGeom>
+                  </pic:spPr>
+                </pic:pic>
+              </a:graphicData>
+            </a:graphic>
+          </wp:inline>
+        </w:drawing>
+      </w:r>
+    </w:p>
+    <w:p>
+      <w:r>
+        <w:lastRenderedPageBreak/>
+        <w:t>Our Flink Job:</w:t>
+      </w:r>
+      <w:r>
+        <w:br/>
+      </w:r>
+      <w:r>
+        <w:drawing>
+          <wp:inline distT="0" distB="0" distL="0" distR="0" wp14:anchorId="085298C2" wp14:editId="2F691B9B">
+            <wp:extent cx="4191000" cy="3299069"/>
+            <wp:effectExtent l="0" t="0" r="0" b="0"/>
+            <wp:docPr id="1899329990" name="Picture 1"/>
+            <wp:cNvGraphicFramePr>
+              <a:graphicFrameLocks xmlns:a="http://schemas.openxmlformats.org/drawingml/2006/main" noChangeAspect="1"/>
+            </wp:cNvGraphicFramePr>
+            <a:graphic xmlns:a="http://schemas.openxmlformats.org/drawingml/2006/main">
+              <a:graphicData uri="http://schemas.openxmlformats.org/drawingml/2006/picture">
+                <pic:pic xmlns:pic="http://schemas.openxmlformats.org/drawingml/2006/picture">
+                  <pic:nvPicPr>
+                    <pic:cNvPr id="1899329990" name=""/>
+                    <pic:cNvPicPr/>
+                  </pic:nvPicPr>
+                  <pic:blipFill>
+                    <a:blip r:embed="rId16"/>
+                    <a:stretch>
+                      <a:fillRect/>
+                    </a:stretch>
+                  </pic:blipFill>
+                  <pic:spPr>
+                    <a:xfrm>
+                      <a:off x="0" y="0"/>
+                      <a:ext cx="4201301" cy="3307178"/>
+                    </a:xfrm>
+                    <a:prstGeom prst="rect">
+                      <a:avLst/>
+                    </a:prstGeom>
+                  </pic:spPr>
+                </pic:pic>
+              </a:graphicData>
+            </a:graphic>
+          </wp:inline>
+        </w:drawing>
+      </w:r>
+    </w:p>
+    <w:p>
+      <w:r>
+        <w:t>Summary:</w:t>
+      </w:r>
+      <w:r>
+        <w:br/>
+      </w:r>
+      <w:r>
+        <w:drawing>
+          <wp:inline distT="0" distB="0" distL="0" distR="0" wp14:anchorId="7F2E0039" wp14:editId="5702C213">
+            <wp:extent cx="4152685" cy="2971800"/>
+            <wp:effectExtent l="0" t="0" r="635" b="0"/>
+            <wp:docPr id="839167550" name="Picture 1"/>
+            <wp:cNvGraphicFramePr>
+              <a:graphicFrameLocks xmlns:a="http://schemas.openxmlformats.org/drawingml/2006/main" noChangeAspect="1"/>
+            </wp:cNvGraphicFramePr>
+            <a:graphic xmlns:a="http://schemas.openxmlformats.org/drawingml/2006/main">
+              <a:graphicData uri="http://schemas.openxmlformats.org/drawingml/2006/picture">
+                <pic:pic xmlns:pic="http://schemas.openxmlformats.org/drawingml/2006/picture">
+                  <pic:nvPicPr>
+                    <pic:cNvPr id="839167550" name=""/>
+                    <pic:cNvPicPr/>
+                  </pic:nvPicPr>
+                  <pic:blipFill>
+                    <a:blip r:embed="rId17"/>
+                    <a:stretch>
+                      <a:fillRect/>
+                    </a:stretch>
+                  </pic:blipFill>
+                  <pic:spPr>
+                    <a:xfrm>
+                      <a:off x="0" y="0"/>
+                      <a:ext cx="4167101" cy="2982117"/>
+                    </a:xfrm>
+                    <a:prstGeom prst="rect">
+                      <a:avLst/>
+                    </a:prstGeom>
+                  </pic:spPr>
+                </pic:pic>
+              </a:graphicData>
+            </a:graphic>
+          </wp:inline>
+        </w:drawing>
+      </w:r>
+    </w:p>
+    <w:p>
+      <w:pPr>
+        <w:rPr>
+          <w:sz w:val="32"/>
+          <w:szCs w:val="32"/>
+        </w:rPr>
+      </w:pPr>
+    </w:p>
+    <w:p>
+      <w:pPr>
+        <w:rPr>
+          <w:sz w:val="32"/>
+          <w:szCs w:val="32"/>
+        </w:rPr>
+      </w:pPr>
+    </w:p>
+    <w:p>
+      <w:pPr>
+        <w:rPr>
+          <w:sz w:val="32"/>
+          <w:szCs w:val="32"/>
+        </w:rPr>
+      </w:pPr>
+    </w:p>
+    <w:p>
+      <w:pPr>
+        <w:rPr>
+          <w:sz w:val="32"/>
+          <w:szCs w:val="32"/>
+        </w:rPr>
+      </w:pPr>
+      <w:r>
+        <w:rPr>
+          <w:sz w:val="32"/>
+          <w:szCs w:val="32"/>
+        </w:rPr>
+        <w:lastRenderedPageBreak/>
+        <w:t>Flink 1 Min Candle output:</w:t>
+      </w:r>
+      <w:r>
+        <w:rPr>
+          <w:sz w:val="32"/>
+          <w:szCs w:val="32"/>
+        </w:rPr>
+        <w:br/>
+      </w:r>
+      <w:r>
+        <w:rPr>
+          <w:sz w:val="32"/>
+          <w:szCs w:val="32"/>
+        </w:rPr>
+        <w:drawing>
+          <wp:inline distT="0" distB="0" distL="0" distR="0" wp14:anchorId="78925ED5" wp14:editId="5E7838A3">
+            <wp:extent cx="5943600" cy="1844040"/>
+            <wp:effectExtent l="0" t="0" r="0" b="3810"/>
+            <wp:docPr id="563195692" name="Picture 1"/>
+            <wp:cNvGraphicFramePr>
+              <a:graphicFrameLocks xmlns:a="http://schemas.openxmlformats.org/drawingml/2006/main" noChangeAspect="1"/>
+            </wp:cNvGraphicFramePr>
+            <a:graphic xmlns:a="http://schemas.openxmlformats.org/drawingml/2006/main">
+              <a:graphicData uri="http://schemas.openxmlformats.org/drawingml/2006/picture">
+                <pic:pic xmlns:pic="http://schemas.openxmlformats.org/drawingml/2006/picture">
+                  <pic:nvPicPr>
+                    <pic:cNvPr id="563195692" name=""/>
+                    <pic:cNvPicPr/>
+                  </pic:nvPicPr>
+                  <pic:blipFill>
+                    <a:blip r:embed="rId18"/>
+                    <a:stretch>
+                      <a:fillRect/>
+                    </a:stretch>
+                  </pic:blipFill>
+                  <pic:spPr>
+                    <a:xfrm>
+                      <a:off x="0" y="0"/>
+                      <a:ext cx="5943600" cy="1844040"/>
+                    </a:xfrm>
+                    <a:prstGeom prst="rect">
+                      <a:avLst/>
+                    </a:prstGeom>
+                  </pic:spPr>
+                </pic:pic>
+              </a:graphicData>
+            </a:graphic>
+          </wp:inline>
+        </w:drawing>
+      </w:r>
+    </w:p>
+    <w:p>
+      <w:r>
+        <w:object w:dxaOrig="1516" w:dyaOrig="989" w14:anchorId="2BCD91A6">
+          <v:shapetype id="_x0000_t75" coordsize="21600,21600" o:spt="75" o:preferrelative="t" path="m@4@5l@4@11@9@11@9@5xe" filled="f" stroked="f">
+            <v:stroke joinstyle="miter"/>
+            <v:formulas>
+              <v:f eqn="if lineDrawn pixelLineWidth 0"/>
+              <v:f eqn="sum @0 1 0"/>
+              <v:f eqn="sum 0 0 @1"/>
+              <v:f eqn="prod @2 1 2"/>
+              <v:f eqn="prod @3 21600 pixelWidth"/>
+              <v:f eqn="prod @3 21600 pixelHeight"/>
+              <v:f eqn="sum @0 0 1"/>
+              <v:f eqn="prod @6 1 2"/>
+              <v:f eqn="prod @7 21600 pixelWidth"/>
+              <v:f eqn="sum @8 21600 0"/>
+              <v:f eqn="prod @7 21600 pixelHeight"/>
+              <v:f eqn="sum @10 21600 0"/>
+            </v:formulas>
+            <v:path o:extrusionok="f" gradientshapeok="t" o:connecttype="rect"/>
+            <o:lock v:ext="edit" aspectratio="t"/>
+          </v:shapetype>
+          <v:shape id="_x0000_i1027" type="#_x0000_t75" style="width:75.6pt;height:49.2pt" o:ole="">
+            <v:imagedata r:id="rId19" o:title=""/>
+          </v:shape>
+          <o:OLEObject Type="Embed" ProgID="Package" ShapeID="_x0000_i1027" DrawAspect="Icon" ObjectID="_1850841649" r:id="rId20"/>
+        </w:object>
+      </w:r>
+    </w:p>
+    <w:p/>
     <w:p>
       <w:pPr>
         <w:rPr>
@@ -5173,6 +5024,7 @@
   <w:style w:type="character" w:default="1" w:styleId="DefaultParagraphFont">
     <w:name w:val="Default Paragraph Font"/>
     <w:uiPriority w:val="1"/>
+    <w:semiHidden/>
     <w:unhideWhenUsed/>
   </w:style>
   <w:style w:type="table" w:default="1" w:styleId="TableNormal">

</xml_diff>